<commit_message>
Flujo propuesto, visita técnica, informe de no conformidad y bandeja con filtros
- Diagrama del flujo en draw.io y PNG, con comparación frente al flujo de Sistemas
- Prototipo: columnas y filtros por columna en la bandeja, etiqueta de trazabilidad
  obligatoria, visita técnica, Informe de No Conformidad, vista del flujo,
  pendientes por rol y letra más grande
- Documento de observaciones actualizado (25 cambios, flujo y anexo)

Co-Authored-By: Claude Opus 5.5 <noreply@anthropic.com>
Claude-Session: https://claude.ai/code/session_01G3iVUQidUbh96xWzhDrLzE
</commit_message>
<xml_diff>
--- a/propuesta-calidad/Informe_Observaciones_Quejas_Reclamos_ETIMET_Octubre_2026.docx
+++ b/propuesta-calidad/Informe_Observaciones_Quejas_Reclamos_ETIMET_Octubre_2026.docx
@@ -86,7 +86,7 @@
                                 <w:b/>
                                 <w:bCs/>
                               </w:rPr>
-                              <w:t>2</w:t>
+                              <w:t>6</w:t>
                             </w:r>
                             <w:r>
                               <w:rPr>
@@ -134,7 +134,7 @@
                           <w:b/>
                           <w:bCs/>
                         </w:rPr>
-                        <w:t>2</w:t>
+                        <w:t>6</w:t>
                       </w:r>
                       <w:r>
                         <w:rPr>
@@ -767,7 +767,7 @@
                 <w:sz w:val="22"/>
                 <w:szCs w:val="22"/>
               </w:rPr>
-              <w:t xml:space="preserve">2 de octubre de 2026</w:t>
+              <w:t xml:space="preserve">6 de octubre de 2026</w:t>
             </w:r>
           </w:p>
         </w:tc>
@@ -1723,6 +1723,85 @@
           </w:p>
         </w:tc>
       </w:tr>
+      <w:tr>
+        <w:trPr>
+          <w:cantSplit/>
+        </w:trPr>
+        <w:tc>
+          <w:tcPr>
+            <w:tcW w:w="700" w:type="dxa"/>
+          </w:tcPr>
+          <w:p>
+            <w:pPr>
+              <w:spacing w:before="40" w:after="40"/>
+              <w:jc w:val="center"/>
+            </w:pPr>
+            <w:r>
+              <w:rPr>
+                <w:rFonts w:ascii="Arial" w:hAnsi="Arial" w:cs="Arial"/>
+                <w:sz w:val="19"/>
+                <w:szCs w:val="19"/>
+              </w:rPr>
+              <w:t xml:space="preserve">C25</w:t>
+            </w:r>
+          </w:p>
+        </w:tc>
+        <w:tc>
+          <w:tcPr>
+            <w:tcW w:w="2200" w:type="dxa"/>
+          </w:tcPr>
+          <w:p>
+            <w:pPr>
+              <w:spacing w:before="40" w:after="40"/>
+            </w:pPr>
+            <w:r>
+              <w:rPr>
+                <w:rFonts w:ascii="Arial" w:hAnsi="Arial" w:cs="Arial"/>
+                <w:sz w:val="19"/>
+                <w:szCs w:val="19"/>
+              </w:rPr>
+              <w:t xml:space="preserve">Foto de la etiqueta de trazabilidad obligatoria</w:t>
+            </w:r>
+          </w:p>
+        </w:tc>
+        <w:tc>
+          <w:tcPr>
+            <w:tcW w:w="4604" w:type="dxa"/>
+          </w:tcPr>
+          <w:p>
+            <w:pPr>
+              <w:spacing w:before="40" w:after="40"/>
+            </w:pPr>
+            <w:r>
+              <w:rPr>
+                <w:rFonts w:ascii="Arial" w:hAnsi="Arial" w:cs="Arial"/>
+                <w:sz w:val="19"/>
+                <w:szCs w:val="19"/>
+              </w:rPr>
+              <w:t xml:space="preserve">Además de las evidencias, el asesor adjunta la foto de la etiqueta de trazabilidad del rollo o la caja. Es obligatoria y aparece como columna en la bandeja, para confirmar OP y lote sin pedirla después.</w:t>
+            </w:r>
+          </w:p>
+        </w:tc>
+        <w:tc>
+          <w:tcPr>
+            <w:tcW w:w="1000" w:type="dxa"/>
+          </w:tcPr>
+          <w:p>
+            <w:pPr>
+              <w:spacing w:before="40" w:after="40"/>
+              <w:jc w:val="center"/>
+            </w:pPr>
+            <w:r>
+              <w:rPr>
+                <w:rFonts w:ascii="Arial" w:hAnsi="Arial" w:cs="Arial"/>
+                <w:sz w:val="19"/>
+                <w:szCs w:val="19"/>
+              </w:rPr>
+              <w:t xml:space="preserve">Alta</w:t>
+            </w:r>
+          </w:p>
+        </w:tc>
+      </w:tr>
     </w:tbl>
     <w:p>
       <w:pPr>
@@ -2879,6 +2958,85 @@
           </w:p>
         </w:tc>
       </w:tr>
+      <w:tr>
+        <w:trPr>
+          <w:cantSplit/>
+        </w:trPr>
+        <w:tc>
+          <w:tcPr>
+            <w:tcW w:w="700" w:type="dxa"/>
+          </w:tcPr>
+          <w:p>
+            <w:pPr>
+              <w:spacing w:before="40" w:after="40"/>
+              <w:jc w:val="center"/>
+            </w:pPr>
+            <w:r>
+              <w:rPr>
+                <w:rFonts w:ascii="Arial" w:hAnsi="Arial" w:cs="Arial"/>
+                <w:sz w:val="19"/>
+                <w:szCs w:val="19"/>
+              </w:rPr>
+              <w:t xml:space="preserve">C24</w:t>
+            </w:r>
+          </w:p>
+        </w:tc>
+        <w:tc>
+          <w:tcPr>
+            <w:tcW w:w="2200" w:type="dxa"/>
+          </w:tcPr>
+          <w:p>
+            <w:pPr>
+              <w:spacing w:before="40" w:after="40"/>
+            </w:pPr>
+            <w:r>
+              <w:rPr>
+                <w:rFonts w:ascii="Arial" w:hAnsi="Arial" w:cs="Arial"/>
+                <w:sz w:val="19"/>
+                <w:szCs w:val="19"/>
+              </w:rPr>
+              <w:t xml:space="preserve">Visita técnica</w:t>
+            </w:r>
+          </w:p>
+        </w:tc>
+        <w:tc>
+          <w:tcPr>
+            <w:tcW w:w="4604" w:type="dxa"/>
+          </w:tcPr>
+          <w:p>
+            <w:pPr>
+              <w:spacing w:before="40" w:after="40"/>
+            </w:pPr>
+            <w:r>
+              <w:rPr>
+                <w:rFonts w:ascii="Arial" w:hAnsi="Arial" w:cs="Arial"/>
+                <w:sz w:val="19"/>
+                <w:szCs w:val="19"/>
+              </w:rPr>
+              <w:t xml:space="preserve">Al analizar, Calidad decide si se requiere visita técnica al cliente. Si se requiere: fecha, responsable, aviso al asesor para coordinar con el cliente y registro de hallazgos. Si no, se deja constancia.</w:t>
+            </w:r>
+          </w:p>
+        </w:tc>
+        <w:tc>
+          <w:tcPr>
+            <w:tcW w:w="1000" w:type="dxa"/>
+          </w:tcPr>
+          <w:p>
+            <w:pPr>
+              <w:spacing w:before="40" w:after="40"/>
+              <w:jc w:val="center"/>
+            </w:pPr>
+            <w:r>
+              <w:rPr>
+                <w:rFonts w:ascii="Arial" w:hAnsi="Arial" w:cs="Arial"/>
+                <w:sz w:val="19"/>
+                <w:szCs w:val="19"/>
+              </w:rPr>
+              <w:t xml:space="preserve">Alta</w:t>
+            </w:r>
+          </w:p>
+        </w:tc>
+      </w:tr>
     </w:tbl>
     <w:p>
       <w:pPr>
@@ -3205,7 +3363,7 @@
                 <w:sz w:val="19"/>
                 <w:szCs w:val="19"/>
               </w:rPr>
-              <w:t xml:space="preserve">Informe de respuesta al cliente</w:t>
+              <w:t xml:space="preserve">Informe de No Conformidad de Calidad</w:t>
             </w:r>
           </w:p>
         </w:tc>
@@ -3223,7 +3381,7 @@
                 <w:sz w:val="19"/>
                 <w:szCs w:val="19"/>
               </w:rPr>
-              <w:t xml:space="preserve">El sistema arma el informe con los datos del ticket en formato ETIMET (PDF) para que el asesor lo envíe al cliente.</w:t>
+              <w:t xml:space="preserve">Calidad elabora y envía su Informe de No Conformidad desde el módulo. El sistema lo arma con los datos del ticket (cliente, referencia, OP, lote, evidencias, visita, causa, acciones y solución) y registra la fecha de envío al asesor y al cliente. Reemplaza el texto libre de "informe de cierre".</w:t>
             </w:r>
           </w:p>
         </w:tc>
@@ -3242,7 +3400,7 @@
                 <w:sz w:val="19"/>
                 <w:szCs w:val="19"/>
               </w:rPr>
-              <w:t xml:space="preserve">Media</w:t>
+              <w:t xml:space="preserve">Alta</w:t>
             </w:r>
           </w:p>
         </w:tc>
@@ -3835,7 +3993,7 @@
                 <w:sz w:val="19"/>
                 <w:szCs w:val="19"/>
               </w:rPr>
-              <w:t xml:space="preserve">Búsqueda, filtros y exportación</w:t>
+              <w:t xml:space="preserve">Bandeja con más columnas y filtros por columna</w:t>
             </w:r>
           </w:p>
         </w:tc>
@@ -3853,7 +4011,7 @@
                 <w:sz w:val="19"/>
                 <w:szCs w:val="19"/>
               </w:rPr>
-              <w:t xml:space="preserve">Buscar por N°, cliente, factura, OP o lote; filtrar por área; exportar a Excel. El asesor ve solo sus tickets.</w:t>
+              <w:t xml:space="preserve">Columnas de cliente, referencia, OP, cantidad facturada, cantidad afectada, lote, evidencias, etiqueta de trazabilidad y asesor. Cada filtro es una lista desplegable en la que también se puede escribir para buscar. Se puede ordenar por columna, cambiar a vista resumida y exportar a Excel. El asesor ve solo sus tickets.</w:t>
             </w:r>
           </w:p>
         </w:tc>
@@ -4527,7 +4685,7 @@
           <w:sz w:val="28"/>
           <w:szCs w:val="28"/>
         </w:rPr>
-        <w:t xml:space="preserve">5. FLUJO AJUSTADO</w:t>
+        <w:t xml:space="preserve">5. FLUJO PROPUESTO Y COMPARACIÓN CON SISTEMAS</w:t>
       </w:r>
     </w:p>
     <w:p>
@@ -4541,7 +4699,21 @@
           <w:sz w:val="24"/>
           <w:szCs w:val="24"/>
         </w:rPr>
-        <w:t xml:space="preserve">Se mantiene el flujo del documento de análisis. Los cambios están en los pasos 6a, 6c y 7, donde se define quién analiza y qué se registra.</w:t>
+        <w:t xml:space="preserve">El flujo propuesto tiene 19 pasos entre tareas y decisiones. 14 de ellos (74 %) ya estaban en el flujo de Sistemas y no se elimina ninguno: 7 quedan iguales, 7 se ajustan (mismo paso con más datos o con responsable definido) y 5 son nuevos.</w:t>
+      </w:r>
+    </w:p>
+    <w:p>
+      <w:pPr>
+        <w:spacing w:after="120"/>
+        <w:jc w:val="both"/>
+      </w:pPr>
+      <w:r>
+        <w:rPr>
+          <w:rFonts w:ascii="Arial" w:hAnsi="Arial" w:cs="Arial"/>
+          <w:sz w:val="24"/>
+          <w:szCs w:val="24"/>
+        </w:rPr>
+        <w:t xml:space="preserve">Se mantienen los mismos estados (Recibido, En análisis, Cerrado, Devuelto y Rechazado) y las mismas dos decisiones de Calidad (¿está completa la información? y ¿procede?). Los cambios se concentran en tres puntos: se agrega el carril de Área responsable para el análisis, se agrega la decisión de visita técnica, y el cierre pasa por el Informe de No Conformidad de Calidad y la verificación de eficacia. El diagrama completo está en el Anexo 1 y en el archivo editable flujo_quejas_reclamos_propuesto.drawio.</w:t>
       </w:r>
     </w:p>
     <w:tbl>
@@ -4558,10 +4730,10 @@
         <w:tblLayout w:type="fixed"/>
       </w:tblPr>
       <w:tblGrid>
-        <w:gridCol w:w="700"/>
-        <w:gridCol w:w="1800"/>
-        <w:gridCol w:w="4504"/>
-        <w:gridCol w:w="1500"/>
+        <w:gridCol w:w="3100"/>
+        <w:gridCol w:w="1600"/>
+        <w:gridCol w:w="1100"/>
+        <w:gridCol w:w="2704"/>
       </w:tblGrid>
       <w:tr>
         <w:trPr>
@@ -4570,7 +4742,7 @@
         </w:trPr>
         <w:tc>
           <w:tcPr>
-            <w:tcW w:w="700" w:type="dxa"/>
+            <w:tcW w:w="3100" w:type="dxa"/>
             <w:shd w:val="clear" w:color="auto" w:fill="2A6BAE"/>
           </w:tcPr>
           <w:p>
@@ -4582,8 +4754,8 @@
                 <w:rFonts w:ascii="Arial" w:hAnsi="Arial" w:cs="Arial"/>
                 <w:b/>
                 <w:color w:val="FFFFFF"/>
-                <w:sz w:val="19"/>
-                <w:szCs w:val="19"/>
+                <w:sz w:val="18"/>
+                <w:szCs w:val="18"/>
               </w:rPr>
               <w:t xml:space="preserve">Paso</w:t>
             </w:r>
@@ -4591,7 +4763,7 @@
         </w:tc>
         <w:tc>
           <w:tcPr>
-            <w:tcW w:w="1800" w:type="dxa"/>
+            <w:tcW w:w="1600" w:type="dxa"/>
             <w:shd w:val="clear" w:color="auto" w:fill="2A6BAE"/>
           </w:tcPr>
           <w:p>
@@ -4603,8 +4775,8 @@
                 <w:rFonts w:ascii="Arial" w:hAnsi="Arial" w:cs="Arial"/>
                 <w:b/>
                 <w:color w:val="FFFFFF"/>
-                <w:sz w:val="19"/>
-                <w:szCs w:val="19"/>
+                <w:sz w:val="18"/>
+                <w:szCs w:val="18"/>
               </w:rPr>
               <w:t xml:space="preserve">Responsable</w:t>
             </w:r>
@@ -4612,7 +4784,7 @@
         </w:tc>
         <w:tc>
           <w:tcPr>
-            <w:tcW w:w="4504" w:type="dxa"/>
+            <w:tcW w:w="1100" w:type="dxa"/>
             <w:shd w:val="clear" w:color="auto" w:fill="2A6BAE"/>
           </w:tcPr>
           <w:p>
@@ -4624,16 +4796,16 @@
                 <w:rFonts w:ascii="Arial" w:hAnsi="Arial" w:cs="Arial"/>
                 <w:b/>
                 <w:color w:val="FFFFFF"/>
-                <w:sz w:val="19"/>
-                <w:szCs w:val="19"/>
-              </w:rPr>
-              <w:t xml:space="preserve">Descripción</w:t>
-            </w:r>
-          </w:p>
-        </w:tc>
-        <w:tc>
-          <w:tcPr>
-            <w:tcW w:w="1500" w:type="dxa"/>
+                <w:sz w:val="18"/>
+                <w:szCs w:val="18"/>
+              </w:rPr>
+              <w:t xml:space="preserve">Frente a Sistemas</w:t>
+            </w:r>
+          </w:p>
+        </w:tc>
+        <w:tc>
+          <w:tcPr>
+            <w:tcW w:w="2704" w:type="dxa"/>
             <w:shd w:val="clear" w:color="auto" w:fill="2A6BAE"/>
           </w:tcPr>
           <w:p>
@@ -4645,10 +4817,10 @@
                 <w:rFonts w:ascii="Arial" w:hAnsi="Arial" w:cs="Arial"/>
                 <w:b/>
                 <w:color w:val="FFFFFF"/>
-                <w:sz w:val="19"/>
-                <w:szCs w:val="19"/>
-              </w:rPr>
-              <w:t xml:space="preserve">Estado</w:t>
+                <w:sz w:val="18"/>
+                <w:szCs w:val="18"/>
+              </w:rPr>
+              <w:t xml:space="preserve">Qué cambia</w:t>
             </w:r>
           </w:p>
         </w:tc>
@@ -4659,7 +4831,43 @@
         </w:trPr>
         <w:tc>
           <w:tcPr>
-            <w:tcW w:w="700" w:type="dxa"/>
+            <w:tcW w:w="3100" w:type="dxa"/>
+          </w:tcPr>
+          <w:p>
+            <w:pPr>
+              <w:spacing w:before="40" w:after="40"/>
+            </w:pPr>
+            <w:r>
+              <w:rPr>
+                <w:rFonts w:ascii="Arial" w:hAnsi="Arial" w:cs="Arial"/>
+                <w:sz w:val="18"/>
+                <w:szCs w:val="18"/>
+              </w:rPr>
+              <w:t xml:space="preserve">Ingresar N° de factura u OP</w:t>
+            </w:r>
+          </w:p>
+        </w:tc>
+        <w:tc>
+          <w:tcPr>
+            <w:tcW w:w="1600" w:type="dxa"/>
+          </w:tcPr>
+          <w:p>
+            <w:pPr>
+              <w:spacing w:before="40" w:after="40"/>
+            </w:pPr>
+            <w:r>
+              <w:rPr>
+                <w:rFonts w:ascii="Arial" w:hAnsi="Arial" w:cs="Arial"/>
+                <w:sz w:val="18"/>
+                <w:szCs w:val="18"/>
+              </w:rPr>
+              <w:t xml:space="preserve">Asesor / asistente</w:t>
+            </w:r>
+          </w:p>
+        </w:tc>
+        <w:tc>
+          <w:tcPr>
+            <w:tcW w:w="1100" w:type="dxa"/>
           </w:tcPr>
           <w:p>
             <w:pPr>
@@ -4669,64 +4877,28 @@
             <w:r>
               <w:rPr>
                 <w:rFonts w:ascii="Arial" w:hAnsi="Arial" w:cs="Arial"/>
-                <w:sz w:val="19"/>
-                <w:szCs w:val="19"/>
-              </w:rPr>
-              <w:t xml:space="preserve">1</w:t>
-            </w:r>
-          </w:p>
-        </w:tc>
-        <w:tc>
-          <w:tcPr>
-            <w:tcW w:w="1800" w:type="dxa"/>
-          </w:tcPr>
-          <w:p>
-            <w:pPr>
-              <w:spacing w:before="40" w:after="40"/>
-            </w:pPr>
-            <w:r>
-              <w:rPr>
-                <w:rFonts w:ascii="Arial" w:hAnsi="Arial" w:cs="Arial"/>
-                <w:sz w:val="19"/>
-                <w:szCs w:val="19"/>
-              </w:rPr>
-              <w:t xml:space="preserve">Asesor comercial</w:t>
-            </w:r>
-          </w:p>
-        </w:tc>
-        <w:tc>
-          <w:tcPr>
-            <w:tcW w:w="4504" w:type="dxa"/>
-          </w:tcPr>
-          <w:p>
-            <w:pPr>
-              <w:spacing w:before="40" w:after="40"/>
-            </w:pPr>
-            <w:r>
-              <w:rPr>
-                <w:rFonts w:ascii="Arial" w:hAnsi="Arial" w:cs="Arial"/>
-                <w:sz w:val="19"/>
-                <w:szCs w:val="19"/>
-              </w:rPr>
-              <w:t xml:space="preserve">Ingresa el número de factura u OP, la fecha en que el cliente reportó, el canal y el contacto (C01, C02).</w:t>
-            </w:r>
-          </w:p>
-        </w:tc>
-        <w:tc>
-          <w:tcPr>
-            <w:tcW w:w="1500" w:type="dxa"/>
-          </w:tcPr>
-          <w:p>
-            <w:pPr>
-              <w:spacing w:before="40" w:after="40"/>
-            </w:pPr>
-            <w:r>
-              <w:rPr>
-                <w:rFonts w:ascii="Arial" w:hAnsi="Arial" w:cs="Arial"/>
-                <w:sz w:val="19"/>
-                <w:szCs w:val="19"/>
-              </w:rPr>
-              <w:t xml:space="preserve">—</w:t>
+                <w:sz w:val="18"/>
+                <w:szCs w:val="18"/>
+              </w:rPr>
+              <w:t xml:space="preserve">Igual</w:t>
+            </w:r>
+          </w:p>
+        </w:tc>
+        <w:tc>
+          <w:tcPr>
+            <w:tcW w:w="2704" w:type="dxa"/>
+          </w:tcPr>
+          <w:p>
+            <w:pPr>
+              <w:spacing w:before="40" w:after="40"/>
+            </w:pPr>
+            <w:r>
+              <w:rPr>
+                <w:rFonts w:ascii="Arial" w:hAnsi="Arial" w:cs="Arial"/>
+                <w:sz w:val="18"/>
+                <w:szCs w:val="18"/>
+              </w:rPr>
+              <w:t xml:space="preserve">Igual que en el flujo de Sistemas.</w:t>
             </w:r>
           </w:p>
         </w:tc>
@@ -4737,7 +4909,43 @@
         </w:trPr>
         <w:tc>
           <w:tcPr>
-            <w:tcW w:w="700" w:type="dxa"/>
+            <w:tcW w:w="3100" w:type="dxa"/>
+          </w:tcPr>
+          <w:p>
+            <w:pPr>
+              <w:spacing w:before="40" w:after="40"/>
+            </w:pPr>
+            <w:r>
+              <w:rPr>
+                <w:rFonts w:ascii="Arial" w:hAnsi="Arial" w:cs="Arial"/>
+                <w:sz w:val="18"/>
+                <w:szCs w:val="18"/>
+              </w:rPr>
+              <w:t xml:space="preserve">Traer ítems, OP, lote, datos de producción y antecedentes</w:t>
+            </w:r>
+          </w:p>
+        </w:tc>
+        <w:tc>
+          <w:tcPr>
+            <w:tcW w:w="1600" w:type="dxa"/>
+          </w:tcPr>
+          <w:p>
+            <w:pPr>
+              <w:spacing w:before="40" w:after="40"/>
+            </w:pPr>
+            <w:r>
+              <w:rPr>
+                <w:rFonts w:ascii="Arial" w:hAnsi="Arial" w:cs="Arial"/>
+                <w:sz w:val="18"/>
+                <w:szCs w:val="18"/>
+              </w:rPr>
+              <w:t xml:space="preserve">Sistema</w:t>
+            </w:r>
+          </w:p>
+        </w:tc>
+        <w:tc>
+          <w:tcPr>
+            <w:tcW w:w="1100" w:type="dxa"/>
           </w:tcPr>
           <w:p>
             <w:pPr>
@@ -4747,64 +4955,28 @@
             <w:r>
               <w:rPr>
                 <w:rFonts w:ascii="Arial" w:hAnsi="Arial" w:cs="Arial"/>
-                <w:sz w:val="19"/>
-                <w:szCs w:val="19"/>
-              </w:rPr>
-              <w:t xml:space="preserve">2</w:t>
-            </w:r>
-          </w:p>
-        </w:tc>
-        <w:tc>
-          <w:tcPr>
-            <w:tcW w:w="1800" w:type="dxa"/>
-          </w:tcPr>
-          <w:p>
-            <w:pPr>
-              <w:spacing w:before="40" w:after="40"/>
-            </w:pPr>
-            <w:r>
-              <w:rPr>
-                <w:rFonts w:ascii="Arial" w:hAnsi="Arial" w:cs="Arial"/>
-                <w:sz w:val="19"/>
-                <w:szCs w:val="19"/>
-              </w:rPr>
-              <w:t xml:space="preserve">Sistema</w:t>
-            </w:r>
-          </w:p>
-        </w:tc>
-        <w:tc>
-          <w:tcPr>
-            <w:tcW w:w="4504" w:type="dxa"/>
-          </w:tcPr>
-          <w:p>
-            <w:pPr>
-              <w:spacing w:before="40" w:after="40"/>
-            </w:pPr>
-            <w:r>
-              <w:rPr>
-                <w:rFonts w:ascii="Arial" w:hAnsi="Arial" w:cs="Arial"/>
-                <w:sz w:val="19"/>
-                <w:szCs w:val="19"/>
-              </w:rPr>
-              <w:t xml:space="preserve">Carga ítems, lote, OP y datos de producción (C07). Muestra antecedentes (C06) y alerta si el reporte está fuera del plazo de la política (C03).</w:t>
-            </w:r>
-          </w:p>
-        </w:tc>
-        <w:tc>
-          <w:tcPr>
-            <w:tcW w:w="1500" w:type="dxa"/>
-          </w:tcPr>
-          <w:p>
-            <w:pPr>
-              <w:spacing w:before="40" w:after="40"/>
-            </w:pPr>
-            <w:r>
-              <w:rPr>
-                <w:rFonts w:ascii="Arial" w:hAnsi="Arial" w:cs="Arial"/>
-                <w:sz w:val="19"/>
-                <w:szCs w:val="19"/>
-              </w:rPr>
-              <w:t xml:space="preserve">—</w:t>
+                <w:sz w:val="18"/>
+                <w:szCs w:val="18"/>
+              </w:rPr>
+              <w:t xml:space="preserve">Ajustado</w:t>
+            </w:r>
+          </w:p>
+        </w:tc>
+        <w:tc>
+          <w:tcPr>
+            <w:tcW w:w="2704" w:type="dxa"/>
+          </w:tcPr>
+          <w:p>
+            <w:pPr>
+              <w:spacing w:before="40" w:after="40"/>
+            </w:pPr>
+            <w:r>
+              <w:rPr>
+                <w:rFonts w:ascii="Arial" w:hAnsi="Arial" w:cs="Arial"/>
+                <w:sz w:val="18"/>
+                <w:szCs w:val="18"/>
+              </w:rPr>
+              <w:t xml:space="preserve">Además de ítems y OP, trae máquina, operador, metros y reclamos anteriores del cliente.</w:t>
             </w:r>
           </w:p>
         </w:tc>
@@ -4815,7 +4987,43 @@
         </w:trPr>
         <w:tc>
           <w:tcPr>
-            <w:tcW w:w="700" w:type="dxa"/>
+            <w:tcW w:w="3100" w:type="dxa"/>
+          </w:tcPr>
+          <w:p>
+            <w:pPr>
+              <w:spacing w:before="40" w:after="40"/>
+            </w:pPr>
+            <w:r>
+              <w:rPr>
+                <w:rFonts w:ascii="Arial" w:hAnsi="Arial" w:cs="Arial"/>
+                <w:sz w:val="18"/>
+                <w:szCs w:val="18"/>
+              </w:rPr>
+              <w:t xml:space="preserve">Completar ingreso: ítems, cantidad, defecto, evidencias y etiqueta de trazabilidad</w:t>
+            </w:r>
+          </w:p>
+        </w:tc>
+        <w:tc>
+          <w:tcPr>
+            <w:tcW w:w="1600" w:type="dxa"/>
+          </w:tcPr>
+          <w:p>
+            <w:pPr>
+              <w:spacing w:before="40" w:after="40"/>
+            </w:pPr>
+            <w:r>
+              <w:rPr>
+                <w:rFonts w:ascii="Arial" w:hAnsi="Arial" w:cs="Arial"/>
+                <w:sz w:val="18"/>
+                <w:szCs w:val="18"/>
+              </w:rPr>
+              <w:t xml:space="preserve">Asesor / asistente</w:t>
+            </w:r>
+          </w:p>
+        </w:tc>
+        <w:tc>
+          <w:tcPr>
+            <w:tcW w:w="1100" w:type="dxa"/>
           </w:tcPr>
           <w:p>
             <w:pPr>
@@ -4825,64 +5033,28 @@
             <w:r>
               <w:rPr>
                 <w:rFonts w:ascii="Arial" w:hAnsi="Arial" w:cs="Arial"/>
-                <w:sz w:val="19"/>
-                <w:szCs w:val="19"/>
-              </w:rPr>
-              <w:t xml:space="preserve">3</w:t>
-            </w:r>
-          </w:p>
-        </w:tc>
-        <w:tc>
-          <w:tcPr>
-            <w:tcW w:w="1800" w:type="dxa"/>
-          </w:tcPr>
-          <w:p>
-            <w:pPr>
-              <w:spacing w:before="40" w:after="40"/>
-            </w:pPr>
-            <w:r>
-              <w:rPr>
-                <w:rFonts w:ascii="Arial" w:hAnsi="Arial" w:cs="Arial"/>
-                <w:sz w:val="19"/>
-                <w:szCs w:val="19"/>
-              </w:rPr>
-              <w:t xml:space="preserve">Asesor comercial</w:t>
-            </w:r>
-          </w:p>
-        </w:tc>
-        <w:tc>
-          <w:tcPr>
-            <w:tcW w:w="4504" w:type="dxa"/>
-          </w:tcPr>
-          <w:p>
-            <w:pPr>
-              <w:spacing w:before="40" w:after="40"/>
-            </w:pPr>
-            <w:r>
-              <w:rPr>
-                <w:rFonts w:ascii="Arial" w:hAnsi="Arial" w:cs="Arial"/>
-                <w:sz w:val="19"/>
-                <w:szCs w:val="19"/>
-              </w:rPr>
-              <w:t xml:space="preserve">Selecciona ítems y cantidad, elige área y tipo de defecto del catálogo con su detalle (C04), indica la situación del material y lo que pide el cliente (C05) y adjunta evidencias.</w:t>
-            </w:r>
-          </w:p>
-        </w:tc>
-        <w:tc>
-          <w:tcPr>
-            <w:tcW w:w="1500" w:type="dxa"/>
-          </w:tcPr>
-          <w:p>
-            <w:pPr>
-              <w:spacing w:before="40" w:after="40"/>
-            </w:pPr>
-            <w:r>
-              <w:rPr>
-                <w:rFonts w:ascii="Arial" w:hAnsi="Arial" w:cs="Arial"/>
-                <w:sz w:val="19"/>
-                <w:szCs w:val="19"/>
-              </w:rPr>
-              <w:t xml:space="preserve">—</w:t>
+                <w:sz w:val="18"/>
+                <w:szCs w:val="18"/>
+              </w:rPr>
+              <w:t xml:space="preserve">Ajustado</w:t>
+            </w:r>
+          </w:p>
+        </w:tc>
+        <w:tc>
+          <w:tcPr>
+            <w:tcW w:w="2704" w:type="dxa"/>
+          </w:tcPr>
+          <w:p>
+            <w:pPr>
+              <w:spacing w:before="40" w:after="40"/>
+            </w:pPr>
+            <w:r>
+              <w:rPr>
+                <w:rFonts w:ascii="Arial" w:hAnsi="Arial" w:cs="Arial"/>
+                <w:sz w:val="18"/>
+                <w:szCs w:val="18"/>
+              </w:rPr>
+              <w:t xml:space="preserve">Se agregan fecha y canal del reporte, contacto, tipo de defecto de catálogo, situación del material y foto de la etiqueta de trazabilidad.</w:t>
             </w:r>
           </w:p>
         </w:tc>
@@ -4893,7 +5065,43 @@
         </w:trPr>
         <w:tc>
           <w:tcPr>
-            <w:tcW w:w="700" w:type="dxa"/>
+            <w:tcW w:w="3100" w:type="dxa"/>
+          </w:tcPr>
+          <w:p>
+            <w:pPr>
+              <w:spacing w:before="40" w:after="40"/>
+            </w:pPr>
+            <w:r>
+              <w:rPr>
+                <w:rFonts w:ascii="Arial" w:hAnsi="Arial" w:cs="Arial"/>
+                <w:sz w:val="18"/>
+                <w:szCs w:val="18"/>
+              </w:rPr>
+              <w:t xml:space="preserve">Generar reclamo RECIBIDO y notificar a Calidad</w:t>
+            </w:r>
+          </w:p>
+        </w:tc>
+        <w:tc>
+          <w:tcPr>
+            <w:tcW w:w="1600" w:type="dxa"/>
+          </w:tcPr>
+          <w:p>
+            <w:pPr>
+              <w:spacing w:before="40" w:after="40"/>
+            </w:pPr>
+            <w:r>
+              <w:rPr>
+                <w:rFonts w:ascii="Arial" w:hAnsi="Arial" w:cs="Arial"/>
+                <w:sz w:val="18"/>
+                <w:szCs w:val="18"/>
+              </w:rPr>
+              <w:t xml:space="preserve">Sistema</w:t>
+            </w:r>
+          </w:p>
+        </w:tc>
+        <w:tc>
+          <w:tcPr>
+            <w:tcW w:w="1100" w:type="dxa"/>
           </w:tcPr>
           <w:p>
             <w:pPr>
@@ -4903,64 +5111,28 @@
             <w:r>
               <w:rPr>
                 <w:rFonts w:ascii="Arial" w:hAnsi="Arial" w:cs="Arial"/>
-                <w:sz w:val="19"/>
-                <w:szCs w:val="19"/>
-              </w:rPr>
-              <w:t xml:space="preserve">4</w:t>
-            </w:r>
-          </w:p>
-        </w:tc>
-        <w:tc>
-          <w:tcPr>
-            <w:tcW w:w="1800" w:type="dxa"/>
-          </w:tcPr>
-          <w:p>
-            <w:pPr>
-              <w:spacing w:before="40" w:after="40"/>
-            </w:pPr>
-            <w:r>
-              <w:rPr>
-                <w:rFonts w:ascii="Arial" w:hAnsi="Arial" w:cs="Arial"/>
-                <w:sz w:val="19"/>
-                <w:szCs w:val="19"/>
-              </w:rPr>
-              <w:t xml:space="preserve">Sistema</w:t>
-            </w:r>
-          </w:p>
-        </w:tc>
-        <w:tc>
-          <w:tcPr>
-            <w:tcW w:w="4504" w:type="dxa"/>
-          </w:tcPr>
-          <w:p>
-            <w:pPr>
-              <w:spacing w:before="40" w:after="40"/>
-            </w:pPr>
-            <w:r>
-              <w:rPr>
-                <w:rFonts w:ascii="Arial" w:hAnsi="Arial" w:cs="Arial"/>
-                <w:sz w:val="19"/>
-                <w:szCs w:val="19"/>
-              </w:rPr>
-              <w:t xml:space="preserve">Genera el ticket y notifica a Calidad (C19).</w:t>
-            </w:r>
-          </w:p>
-        </w:tc>
-        <w:tc>
-          <w:tcPr>
-            <w:tcW w:w="1500" w:type="dxa"/>
-          </w:tcPr>
-          <w:p>
-            <w:pPr>
-              <w:spacing w:before="40" w:after="40"/>
-            </w:pPr>
-            <w:r>
-              <w:rPr>
-                <w:rFonts w:ascii="Arial" w:hAnsi="Arial" w:cs="Arial"/>
-                <w:sz w:val="19"/>
-                <w:szCs w:val="19"/>
-              </w:rPr>
-              <w:t xml:space="preserve">Recibido</w:t>
+                <w:sz w:val="18"/>
+                <w:szCs w:val="18"/>
+              </w:rPr>
+              <w:t xml:space="preserve">Ajustado</w:t>
+            </w:r>
+          </w:p>
+        </w:tc>
+        <w:tc>
+          <w:tcPr>
+            <w:tcW w:w="2704" w:type="dxa"/>
+          </w:tcPr>
+          <w:p>
+            <w:pPr>
+              <w:spacing w:before="40" w:after="40"/>
+            </w:pPr>
+            <w:r>
+              <w:rPr>
+                <w:rFonts w:ascii="Arial" w:hAnsi="Arial" w:cs="Arial"/>
+                <w:sz w:val="18"/>
+                <w:szCs w:val="18"/>
+              </w:rPr>
+              <w:t xml:space="preserve">Además avisa si el reporte está fuera del plazo de la política y notifica a Calidad.</w:t>
             </w:r>
           </w:p>
         </w:tc>
@@ -4971,7 +5143,43 @@
         </w:trPr>
         <w:tc>
           <w:tcPr>
-            <w:tcW w:w="700" w:type="dxa"/>
+            <w:tcW w:w="3100" w:type="dxa"/>
+          </w:tcPr>
+          <w:p>
+            <w:pPr>
+              <w:spacing w:before="40" w:after="40"/>
+            </w:pPr>
+            <w:r>
+              <w:rPr>
+                <w:rFonts w:ascii="Arial" w:hAnsi="Arial" w:cs="Arial"/>
+                <w:sz w:val="18"/>
+                <w:szCs w:val="18"/>
+              </w:rPr>
+              <w:t xml:space="preserve">Revisar ingreso</w:t>
+            </w:r>
+          </w:p>
+        </w:tc>
+        <w:tc>
+          <w:tcPr>
+            <w:tcW w:w="1600" w:type="dxa"/>
+          </w:tcPr>
+          <w:p>
+            <w:pPr>
+              <w:spacing w:before="40" w:after="40"/>
+            </w:pPr>
+            <w:r>
+              <w:rPr>
+                <w:rFonts w:ascii="Arial" w:hAnsi="Arial" w:cs="Arial"/>
+                <w:sz w:val="18"/>
+                <w:szCs w:val="18"/>
+              </w:rPr>
+              <w:t xml:space="preserve">Calidad</w:t>
+            </w:r>
+          </w:p>
+        </w:tc>
+        <w:tc>
+          <w:tcPr>
+            <w:tcW w:w="1100" w:type="dxa"/>
           </w:tcPr>
           <w:p>
             <w:pPr>
@@ -4981,64 +5189,28 @@
             <w:r>
               <w:rPr>
                 <w:rFonts w:ascii="Arial" w:hAnsi="Arial" w:cs="Arial"/>
-                <w:sz w:val="19"/>
-                <w:szCs w:val="19"/>
-              </w:rPr>
-              <w:t xml:space="preserve">5</w:t>
-            </w:r>
-          </w:p>
-        </w:tc>
-        <w:tc>
-          <w:tcPr>
-            <w:tcW w:w="1800" w:type="dxa"/>
-          </w:tcPr>
-          <w:p>
-            <w:pPr>
-              <w:spacing w:before="40" w:after="40"/>
-            </w:pPr>
-            <w:r>
-              <w:rPr>
-                <w:rFonts w:ascii="Arial" w:hAnsi="Arial" w:cs="Arial"/>
-                <w:sz w:val="19"/>
-                <w:szCs w:val="19"/>
-              </w:rPr>
-              <w:t xml:space="preserve">Calidad</w:t>
-            </w:r>
-          </w:p>
-        </w:tc>
-        <w:tc>
-          <w:tcPr>
-            <w:tcW w:w="4504" w:type="dxa"/>
-          </w:tcPr>
-          <w:p>
-            <w:pPr>
-              <w:spacing w:before="40" w:after="40"/>
-            </w:pPr>
-            <w:r>
-              <w:rPr>
-                <w:rFonts w:ascii="Arial" w:hAnsi="Arial" w:cs="Arial"/>
-                <w:sz w:val="19"/>
-                <w:szCs w:val="19"/>
-              </w:rPr>
-              <w:t xml:space="preserve">Revisa si la información está completa.</w:t>
-            </w:r>
-          </w:p>
-        </w:tc>
-        <w:tc>
-          <w:tcPr>
-            <w:tcW w:w="1500" w:type="dxa"/>
-          </w:tcPr>
-          <w:p>
-            <w:pPr>
-              <w:spacing w:before="40" w:after="40"/>
-            </w:pPr>
-            <w:r>
-              <w:rPr>
-                <w:rFonts w:ascii="Arial" w:hAnsi="Arial" w:cs="Arial"/>
-                <w:sz w:val="19"/>
-                <w:szCs w:val="19"/>
-              </w:rPr>
-              <w:t xml:space="preserve">Recibido</w:t>
+                <w:sz w:val="18"/>
+                <w:szCs w:val="18"/>
+              </w:rPr>
+              <w:t xml:space="preserve">Igual</w:t>
+            </w:r>
+          </w:p>
+        </w:tc>
+        <w:tc>
+          <w:tcPr>
+            <w:tcW w:w="2704" w:type="dxa"/>
+          </w:tcPr>
+          <w:p>
+            <w:pPr>
+              <w:spacing w:before="40" w:after="40"/>
+            </w:pPr>
+            <w:r>
+              <w:rPr>
+                <w:rFonts w:ascii="Arial" w:hAnsi="Arial" w:cs="Arial"/>
+                <w:sz w:val="18"/>
+                <w:szCs w:val="18"/>
+              </w:rPr>
+              <w:t xml:space="preserve">Igual.</w:t>
             </w:r>
           </w:p>
         </w:tc>
@@ -5049,7 +5221,43 @@
         </w:trPr>
         <w:tc>
           <w:tcPr>
-            <w:tcW w:w="700" w:type="dxa"/>
+            <w:tcW w:w="3100" w:type="dxa"/>
+          </w:tcPr>
+          <w:p>
+            <w:pPr>
+              <w:spacing w:before="40" w:after="40"/>
+            </w:pPr>
+            <w:r>
+              <w:rPr>
+                <w:rFonts w:ascii="Arial" w:hAnsi="Arial" w:cs="Arial"/>
+                <w:sz w:val="18"/>
+                <w:szCs w:val="18"/>
+              </w:rPr>
+              <w:t xml:space="preserve">¿Información completa?</w:t>
+            </w:r>
+          </w:p>
+        </w:tc>
+        <w:tc>
+          <w:tcPr>
+            <w:tcW w:w="1600" w:type="dxa"/>
+          </w:tcPr>
+          <w:p>
+            <w:pPr>
+              <w:spacing w:before="40" w:after="40"/>
+            </w:pPr>
+            <w:r>
+              <w:rPr>
+                <w:rFonts w:ascii="Arial" w:hAnsi="Arial" w:cs="Arial"/>
+                <w:sz w:val="18"/>
+                <w:szCs w:val="18"/>
+              </w:rPr>
+              <w:t xml:space="preserve">Calidad</w:t>
+            </w:r>
+          </w:p>
+        </w:tc>
+        <w:tc>
+          <w:tcPr>
+            <w:tcW w:w="1100" w:type="dxa"/>
           </w:tcPr>
           <w:p>
             <w:pPr>
@@ -5059,64 +5267,28 @@
             <w:r>
               <w:rPr>
                 <w:rFonts w:ascii="Arial" w:hAnsi="Arial" w:cs="Arial"/>
-                <w:sz w:val="19"/>
-                <w:szCs w:val="19"/>
-              </w:rPr>
-              <w:t xml:space="preserve">6a</w:t>
-            </w:r>
-          </w:p>
-        </w:tc>
-        <w:tc>
-          <w:tcPr>
-            <w:tcW w:w="1800" w:type="dxa"/>
-          </w:tcPr>
-          <w:p>
-            <w:pPr>
-              <w:spacing w:before="40" w:after="40"/>
-            </w:pPr>
-            <w:r>
-              <w:rPr>
-                <w:rFonts w:ascii="Arial" w:hAnsi="Arial" w:cs="Arial"/>
-                <w:sz w:val="19"/>
-                <w:szCs w:val="19"/>
-              </w:rPr>
-              <w:t xml:space="preserve">Calidad → Asesor</w:t>
-            </w:r>
-          </w:p>
-        </w:tc>
-        <w:tc>
-          <w:tcPr>
-            <w:tcW w:w="4504" w:type="dxa"/>
-          </w:tcPr>
-          <w:p>
-            <w:pPr>
-              <w:spacing w:before="40" w:after="40"/>
-            </w:pPr>
-            <w:r>
-              <w:rPr>
-                <w:rFonts w:ascii="Arial" w:hAnsi="Arial" w:cs="Arial"/>
-                <w:sz w:val="19"/>
-                <w:szCs w:val="19"/>
-              </w:rPr>
-              <w:t xml:space="preserve">Información incompleta: devuelve con motivo del catálogo (C09). El asesor corrige todo el ingreso y reenvía en el mismo ticket (C08).</w:t>
-            </w:r>
-          </w:p>
-        </w:tc>
-        <w:tc>
-          <w:tcPr>
-            <w:tcW w:w="1500" w:type="dxa"/>
-          </w:tcPr>
-          <w:p>
-            <w:pPr>
-              <w:spacing w:before="40" w:after="40"/>
-            </w:pPr>
-            <w:r>
-              <w:rPr>
-                <w:rFonts w:ascii="Arial" w:hAnsi="Arial" w:cs="Arial"/>
-                <w:sz w:val="19"/>
-                <w:szCs w:val="19"/>
-              </w:rPr>
-              <w:t xml:space="preserve">Devuelto</w:t>
+                <w:sz w:val="18"/>
+                <w:szCs w:val="18"/>
+              </w:rPr>
+              <w:t xml:space="preserve">Igual</w:t>
+            </w:r>
+          </w:p>
+        </w:tc>
+        <w:tc>
+          <w:tcPr>
+            <w:tcW w:w="2704" w:type="dxa"/>
+          </w:tcPr>
+          <w:p>
+            <w:pPr>
+              <w:spacing w:before="40" w:after="40"/>
+            </w:pPr>
+            <w:r>
+              <w:rPr>
+                <w:rFonts w:ascii="Arial" w:hAnsi="Arial" w:cs="Arial"/>
+                <w:sz w:val="18"/>
+                <w:szCs w:val="18"/>
+              </w:rPr>
+              <w:t xml:space="preserve">Igual.</w:t>
             </w:r>
           </w:p>
         </w:tc>
@@ -5127,7 +5299,43 @@
         </w:trPr>
         <w:tc>
           <w:tcPr>
-            <w:tcW w:w="700" w:type="dxa"/>
+            <w:tcW w:w="3100" w:type="dxa"/>
+          </w:tcPr>
+          <w:p>
+            <w:pPr>
+              <w:spacing w:before="40" w:after="40"/>
+            </w:pPr>
+            <w:r>
+              <w:rPr>
+                <w:rFonts w:ascii="Arial" w:hAnsi="Arial" w:cs="Arial"/>
+                <w:sz w:val="18"/>
+                <w:szCs w:val="18"/>
+              </w:rPr>
+              <w:t xml:space="preserve">Notificar al asesor con el motivo de devolución</w:t>
+            </w:r>
+          </w:p>
+        </w:tc>
+        <w:tc>
+          <w:tcPr>
+            <w:tcW w:w="1600" w:type="dxa"/>
+          </w:tcPr>
+          <w:p>
+            <w:pPr>
+              <w:spacing w:before="40" w:after="40"/>
+            </w:pPr>
+            <w:r>
+              <w:rPr>
+                <w:rFonts w:ascii="Arial" w:hAnsi="Arial" w:cs="Arial"/>
+                <w:sz w:val="18"/>
+                <w:szCs w:val="18"/>
+              </w:rPr>
+              <w:t xml:space="preserve">Sistema</w:t>
+            </w:r>
+          </w:p>
+        </w:tc>
+        <w:tc>
+          <w:tcPr>
+            <w:tcW w:w="1100" w:type="dxa"/>
           </w:tcPr>
           <w:p>
             <w:pPr>
@@ -5137,64 +5345,28 @@
             <w:r>
               <w:rPr>
                 <w:rFonts w:ascii="Arial" w:hAnsi="Arial" w:cs="Arial"/>
-                <w:sz w:val="19"/>
-                <w:szCs w:val="19"/>
-              </w:rPr>
-              <w:t xml:space="preserve">6b</w:t>
-            </w:r>
-          </w:p>
-        </w:tc>
-        <w:tc>
-          <w:tcPr>
-            <w:tcW w:w="1800" w:type="dxa"/>
-          </w:tcPr>
-          <w:p>
-            <w:pPr>
-              <w:spacing w:before="40" w:after="40"/>
-            </w:pPr>
-            <w:r>
-              <w:rPr>
-                <w:rFonts w:ascii="Arial" w:hAnsi="Arial" w:cs="Arial"/>
-                <w:sz w:val="19"/>
-                <w:szCs w:val="19"/>
-              </w:rPr>
-              <w:t xml:space="preserve">Calidad</w:t>
-            </w:r>
-          </w:p>
-        </w:tc>
-        <w:tc>
-          <w:tcPr>
-            <w:tcW w:w="4504" w:type="dxa"/>
-          </w:tcPr>
-          <w:p>
-            <w:pPr>
-              <w:spacing w:before="40" w:after="40"/>
-            </w:pPr>
-            <w:r>
-              <w:rPr>
-                <w:rFonts w:ascii="Arial" w:hAnsi="Arial" w:cs="Arial"/>
-                <w:sz w:val="19"/>
-                <w:szCs w:val="19"/>
-              </w:rPr>
-              <w:t xml:space="preserve">No procede: rechazo de cierre con motivo del catálogo y observación. Se notifica al asesor.</w:t>
-            </w:r>
-          </w:p>
-        </w:tc>
-        <w:tc>
-          <w:tcPr>
-            <w:tcW w:w="1500" w:type="dxa"/>
-          </w:tcPr>
-          <w:p>
-            <w:pPr>
-              <w:spacing w:before="40" w:after="40"/>
-            </w:pPr>
-            <w:r>
-              <w:rPr>
-                <w:rFonts w:ascii="Arial" w:hAnsi="Arial" w:cs="Arial"/>
-                <w:sz w:val="19"/>
-                <w:szCs w:val="19"/>
-              </w:rPr>
-              <w:t xml:space="preserve">Rechazado</w:t>
+                <w:sz w:val="18"/>
+                <w:szCs w:val="18"/>
+              </w:rPr>
+              <w:t xml:space="preserve">Igual</w:t>
+            </w:r>
+          </w:p>
+        </w:tc>
+        <w:tc>
+          <w:tcPr>
+            <w:tcW w:w="2704" w:type="dxa"/>
+          </w:tcPr>
+          <w:p>
+            <w:pPr>
+              <w:spacing w:before="40" w:after="40"/>
+            </w:pPr>
+            <w:r>
+              <w:rPr>
+                <w:rFonts w:ascii="Arial" w:hAnsi="Arial" w:cs="Arial"/>
+                <w:sz w:val="18"/>
+                <w:szCs w:val="18"/>
+              </w:rPr>
+              <w:t xml:space="preserve">Igual; el motivo sale de un catálogo.</w:t>
             </w:r>
           </w:p>
         </w:tc>
@@ -5205,7 +5377,43 @@
         </w:trPr>
         <w:tc>
           <w:tcPr>
-            <w:tcW w:w="700" w:type="dxa"/>
+            <w:tcW w:w="3100" w:type="dxa"/>
+          </w:tcPr>
+          <w:p>
+            <w:pPr>
+              <w:spacing w:before="40" w:after="40"/>
+            </w:pPr>
+            <w:r>
+              <w:rPr>
+                <w:rFonts w:ascii="Arial" w:hAnsi="Arial" w:cs="Arial"/>
+                <w:sz w:val="18"/>
+                <w:szCs w:val="18"/>
+              </w:rPr>
+              <w:t xml:space="preserve">Corregir el ingreso en el mismo ticket</w:t>
+            </w:r>
+          </w:p>
+        </w:tc>
+        <w:tc>
+          <w:tcPr>
+            <w:tcW w:w="1600" w:type="dxa"/>
+          </w:tcPr>
+          <w:p>
+            <w:pPr>
+              <w:spacing w:before="40" w:after="40"/>
+            </w:pPr>
+            <w:r>
+              <w:rPr>
+                <w:rFonts w:ascii="Arial" w:hAnsi="Arial" w:cs="Arial"/>
+                <w:sz w:val="18"/>
+                <w:szCs w:val="18"/>
+              </w:rPr>
+              <w:t xml:space="preserve">Asesor / asistente</w:t>
+            </w:r>
+          </w:p>
+        </w:tc>
+        <w:tc>
+          <w:tcPr>
+            <w:tcW w:w="1100" w:type="dxa"/>
           </w:tcPr>
           <w:p>
             <w:pPr>
@@ -5215,64 +5423,28 @@
             <w:r>
               <w:rPr>
                 <w:rFonts w:ascii="Arial" w:hAnsi="Arial" w:cs="Arial"/>
-                <w:sz w:val="19"/>
-                <w:szCs w:val="19"/>
-              </w:rPr>
-              <w:t xml:space="preserve">6c</w:t>
-            </w:r>
-          </w:p>
-        </w:tc>
-        <w:tc>
-          <w:tcPr>
-            <w:tcW w:w="1800" w:type="dxa"/>
-          </w:tcPr>
-          <w:p>
-            <w:pPr>
-              <w:spacing w:before="40" w:after="40"/>
-            </w:pPr>
-            <w:r>
-              <w:rPr>
-                <w:rFonts w:ascii="Arial" w:hAnsi="Arial" w:cs="Arial"/>
-                <w:sz w:val="19"/>
-                <w:szCs w:val="19"/>
-              </w:rPr>
-              <w:t xml:space="preserve">Calidad</w:t>
-            </w:r>
-          </w:p>
-        </w:tc>
-        <w:tc>
-          <w:tcPr>
-            <w:tcW w:w="4504" w:type="dxa"/>
-          </w:tcPr>
-          <w:p>
-            <w:pPr>
-              <w:spacing w:before="40" w:after="40"/>
-            </w:pPr>
-            <w:r>
-              <w:rPr>
-                <w:rFonts w:ascii="Arial" w:hAnsi="Arial" w:cs="Arial"/>
-                <w:sz w:val="19"/>
-                <w:szCs w:val="19"/>
-              </w:rPr>
-              <w:t xml:space="preserve">Procede: categoriza como queja o reclamo, asigna severidad (C10), área responsable y fecha compromiso (C11). Se notifica al área y al asesor.</w:t>
-            </w:r>
-          </w:p>
-        </w:tc>
-        <w:tc>
-          <w:tcPr>
-            <w:tcW w:w="1500" w:type="dxa"/>
-          </w:tcPr>
-          <w:p>
-            <w:pPr>
-              <w:spacing w:before="40" w:after="40"/>
-            </w:pPr>
-            <w:r>
-              <w:rPr>
-                <w:rFonts w:ascii="Arial" w:hAnsi="Arial" w:cs="Arial"/>
-                <w:sz w:val="19"/>
-                <w:szCs w:val="19"/>
-              </w:rPr>
-              <w:t xml:space="preserve">En análisis</w:t>
+                <w:sz w:val="18"/>
+                <w:szCs w:val="18"/>
+              </w:rPr>
+              <w:t xml:space="preserve">Ajustado</w:t>
+            </w:r>
+          </w:p>
+        </w:tc>
+        <w:tc>
+          <w:tcPr>
+            <w:tcW w:w="2704" w:type="dxa"/>
+          </w:tcPr>
+          <w:p>
+            <w:pPr>
+              <w:spacing w:before="40" w:after="40"/>
+            </w:pPr>
+            <w:r>
+              <w:rPr>
+                <w:rFonts w:ascii="Arial" w:hAnsi="Arial" w:cs="Arial"/>
+                <w:sz w:val="18"/>
+                <w:szCs w:val="18"/>
+              </w:rPr>
+              <w:t xml:space="preserve">Sistemas solo permitía cargar documentación adicional; ahora se corrige todo el ingreso.</w:t>
             </w:r>
           </w:p>
         </w:tc>
@@ -5283,7 +5455,43 @@
         </w:trPr>
         <w:tc>
           <w:tcPr>
-            <w:tcW w:w="700" w:type="dxa"/>
+            <w:tcW w:w="3100" w:type="dxa"/>
+          </w:tcPr>
+          <w:p>
+            <w:pPr>
+              <w:spacing w:before="40" w:after="40"/>
+            </w:pPr>
+            <w:r>
+              <w:rPr>
+                <w:rFonts w:ascii="Arial" w:hAnsi="Arial" w:cs="Arial"/>
+                <w:sz w:val="18"/>
+                <w:szCs w:val="18"/>
+              </w:rPr>
+              <w:t xml:space="preserve">¿Procede?</w:t>
+            </w:r>
+          </w:p>
+        </w:tc>
+        <w:tc>
+          <w:tcPr>
+            <w:tcW w:w="1600" w:type="dxa"/>
+          </w:tcPr>
+          <w:p>
+            <w:pPr>
+              <w:spacing w:before="40" w:after="40"/>
+            </w:pPr>
+            <w:r>
+              <w:rPr>
+                <w:rFonts w:ascii="Arial" w:hAnsi="Arial" w:cs="Arial"/>
+                <w:sz w:val="18"/>
+                <w:szCs w:val="18"/>
+              </w:rPr>
+              <w:t xml:space="preserve">Calidad</w:t>
+            </w:r>
+          </w:p>
+        </w:tc>
+        <w:tc>
+          <w:tcPr>
+            <w:tcW w:w="1100" w:type="dxa"/>
           </w:tcPr>
           <w:p>
             <w:pPr>
@@ -5293,64 +5501,28 @@
             <w:r>
               <w:rPr>
                 <w:rFonts w:ascii="Arial" w:hAnsi="Arial" w:cs="Arial"/>
-                <w:sz w:val="19"/>
-                <w:szCs w:val="19"/>
-              </w:rPr>
-              <w:t xml:space="preserve">7</w:t>
-            </w:r>
-          </w:p>
-        </w:tc>
-        <w:tc>
-          <w:tcPr>
-            <w:tcW w:w="1800" w:type="dxa"/>
-          </w:tcPr>
-          <w:p>
-            <w:pPr>
-              <w:spacing w:before="40" w:after="40"/>
-            </w:pPr>
-            <w:r>
-              <w:rPr>
-                <w:rFonts w:ascii="Arial" w:hAnsi="Arial" w:cs="Arial"/>
-                <w:sz w:val="19"/>
-                <w:szCs w:val="19"/>
-              </w:rPr>
-              <w:t xml:space="preserve">Área responsable</w:t>
-            </w:r>
-          </w:p>
-        </w:tc>
-        <w:tc>
-          <w:tcPr>
-            <w:tcW w:w="4504" w:type="dxa"/>
-          </w:tcPr>
-          <w:p>
-            <w:pPr>
-              <w:spacing w:before="40" w:after="40"/>
-            </w:pPr>
-            <w:r>
-              <w:rPr>
-                <w:rFonts w:ascii="Arial" w:hAnsi="Arial" w:cs="Arial"/>
-                <w:sz w:val="19"/>
-                <w:szCs w:val="19"/>
-              </w:rPr>
-              <w:t xml:space="preserve">Registra contención, causa raíz (C13) y plan de acciones con responsable y fecha (C14). Envía a Calidad.</w:t>
-            </w:r>
-          </w:p>
-        </w:tc>
-        <w:tc>
-          <w:tcPr>
-            <w:tcW w:w="1500" w:type="dxa"/>
-          </w:tcPr>
-          <w:p>
-            <w:pPr>
-              <w:spacing w:before="40" w:after="40"/>
-            </w:pPr>
-            <w:r>
-              <w:rPr>
-                <w:rFonts w:ascii="Arial" w:hAnsi="Arial" w:cs="Arial"/>
-                <w:sz w:val="19"/>
-                <w:szCs w:val="19"/>
-              </w:rPr>
-              <w:t xml:space="preserve">En análisis</w:t>
+                <w:sz w:val="18"/>
+                <w:szCs w:val="18"/>
+              </w:rPr>
+              <w:t xml:space="preserve">Igual</w:t>
+            </w:r>
+          </w:p>
+        </w:tc>
+        <w:tc>
+          <w:tcPr>
+            <w:tcW w:w="2704" w:type="dxa"/>
+          </w:tcPr>
+          <w:p>
+            <w:pPr>
+              <w:spacing w:before="40" w:after="40"/>
+            </w:pPr>
+            <w:r>
+              <w:rPr>
+                <w:rFonts w:ascii="Arial" w:hAnsi="Arial" w:cs="Arial"/>
+                <w:sz w:val="18"/>
+                <w:szCs w:val="18"/>
+              </w:rPr>
+              <w:t xml:space="preserve">Igual.</w:t>
             </w:r>
           </w:p>
         </w:tc>
@@ -5361,7 +5533,43 @@
         </w:trPr>
         <w:tc>
           <w:tcPr>
-            <w:tcW w:w="700" w:type="dxa"/>
+            <w:tcW w:w="3100" w:type="dxa"/>
+          </w:tcPr>
+          <w:p>
+            <w:pPr>
+              <w:spacing w:before="40" w:after="40"/>
+            </w:pPr>
+            <w:r>
+              <w:rPr>
+                <w:rFonts w:ascii="Arial" w:hAnsi="Arial" w:cs="Arial"/>
+                <w:sz w:val="18"/>
+                <w:szCs w:val="18"/>
+              </w:rPr>
+              <w:t xml:space="preserve">Rechazar con motivo del catálogo y observación</w:t>
+            </w:r>
+          </w:p>
+        </w:tc>
+        <w:tc>
+          <w:tcPr>
+            <w:tcW w:w="1600" w:type="dxa"/>
+          </w:tcPr>
+          <w:p>
+            <w:pPr>
+              <w:spacing w:before="40" w:after="40"/>
+            </w:pPr>
+            <w:r>
+              <w:rPr>
+                <w:rFonts w:ascii="Arial" w:hAnsi="Arial" w:cs="Arial"/>
+                <w:sz w:val="18"/>
+                <w:szCs w:val="18"/>
+              </w:rPr>
+              <w:t xml:space="preserve">Calidad</w:t>
+            </w:r>
+          </w:p>
+        </w:tc>
+        <w:tc>
+          <w:tcPr>
+            <w:tcW w:w="1100" w:type="dxa"/>
           </w:tcPr>
           <w:p>
             <w:pPr>
@@ -5371,64 +5579,28 @@
             <w:r>
               <w:rPr>
                 <w:rFonts w:ascii="Arial" w:hAnsi="Arial" w:cs="Arial"/>
-                <w:sz w:val="19"/>
-                <w:szCs w:val="19"/>
-              </w:rPr>
-              <w:t xml:space="preserve">8</w:t>
-            </w:r>
-          </w:p>
-        </w:tc>
-        <w:tc>
-          <w:tcPr>
-            <w:tcW w:w="1800" w:type="dxa"/>
-          </w:tcPr>
-          <w:p>
-            <w:pPr>
-              <w:spacing w:before="40" w:after="40"/>
-            </w:pPr>
-            <w:r>
-              <w:rPr>
-                <w:rFonts w:ascii="Arial" w:hAnsi="Arial" w:cs="Arial"/>
-                <w:sz w:val="19"/>
-                <w:szCs w:val="19"/>
-              </w:rPr>
-              <w:t xml:space="preserve">Calidad</w:t>
-            </w:r>
-          </w:p>
-        </w:tc>
-        <w:tc>
-          <w:tcPr>
-            <w:tcW w:w="4504" w:type="dxa"/>
-          </w:tcPr>
-          <w:p>
-            <w:pPr>
-              <w:spacing w:before="40" w:after="40"/>
-            </w:pPr>
-            <w:r>
-              <w:rPr>
-                <w:rFonts w:ascii="Arial" w:hAnsi="Arial" w:cs="Arial"/>
-                <w:sz w:val="19"/>
-                <w:szCs w:val="19"/>
-              </w:rPr>
-              <w:t xml:space="preserve">Registra solución al cliente y costo (C15), informe de cierre y fecha de verificación de eficacia (C16). Cierra y se genera el informe para el cliente (C17).</w:t>
-            </w:r>
-          </w:p>
-        </w:tc>
-        <w:tc>
-          <w:tcPr>
-            <w:tcW w:w="1500" w:type="dxa"/>
-          </w:tcPr>
-          <w:p>
-            <w:pPr>
-              <w:spacing w:before="40" w:after="40"/>
-            </w:pPr>
-            <w:r>
-              <w:rPr>
-                <w:rFonts w:ascii="Arial" w:hAnsi="Arial" w:cs="Arial"/>
-                <w:sz w:val="19"/>
-                <w:szCs w:val="19"/>
-              </w:rPr>
-              <w:t xml:space="preserve">Cerrado</w:t>
+                <w:sz w:val="18"/>
+                <w:szCs w:val="18"/>
+              </w:rPr>
+              <w:t xml:space="preserve">Igual</w:t>
+            </w:r>
+          </w:p>
+        </w:tc>
+        <w:tc>
+          <w:tcPr>
+            <w:tcW w:w="2704" w:type="dxa"/>
+          </w:tcPr>
+          <w:p>
+            <w:pPr>
+              <w:spacing w:before="40" w:after="40"/>
+            </w:pPr>
+            <w:r>
+              <w:rPr>
+                <w:rFonts w:ascii="Arial" w:hAnsi="Arial" w:cs="Arial"/>
+                <w:sz w:val="18"/>
+                <w:szCs w:val="18"/>
+              </w:rPr>
+              <w:t xml:space="preserve">Igual (une "Rechazar" y "Registrar motivo").</w:t>
             </w:r>
           </w:p>
         </w:tc>
@@ -5439,7 +5611,43 @@
         </w:trPr>
         <w:tc>
           <w:tcPr>
-            <w:tcW w:w="700" w:type="dxa"/>
+            <w:tcW w:w="3100" w:type="dxa"/>
+          </w:tcPr>
+          <w:p>
+            <w:pPr>
+              <w:spacing w:before="40" w:after="40"/>
+            </w:pPr>
+            <w:r>
+              <w:rPr>
+                <w:rFonts w:ascii="Arial" w:hAnsi="Arial" w:cs="Arial"/>
+                <w:sz w:val="18"/>
+                <w:szCs w:val="18"/>
+              </w:rPr>
+              <w:t xml:space="preserve">Categorizar, dar severidad y asignar área y fecha</w:t>
+            </w:r>
+          </w:p>
+        </w:tc>
+        <w:tc>
+          <w:tcPr>
+            <w:tcW w:w="1600" w:type="dxa"/>
+          </w:tcPr>
+          <w:p>
+            <w:pPr>
+              <w:spacing w:before="40" w:after="40"/>
+            </w:pPr>
+            <w:r>
+              <w:rPr>
+                <w:rFonts w:ascii="Arial" w:hAnsi="Arial" w:cs="Arial"/>
+                <w:sz w:val="18"/>
+                <w:szCs w:val="18"/>
+              </w:rPr>
+              <w:t xml:space="preserve">Calidad</w:t>
+            </w:r>
+          </w:p>
+        </w:tc>
+        <w:tc>
+          <w:tcPr>
+            <w:tcW w:w="1100" w:type="dxa"/>
           </w:tcPr>
           <w:p>
             <w:pPr>
@@ -5449,26 +5657,67 @@
             <w:r>
               <w:rPr>
                 <w:rFonts w:ascii="Arial" w:hAnsi="Arial" w:cs="Arial"/>
-                <w:sz w:val="19"/>
-                <w:szCs w:val="19"/>
-              </w:rPr>
-              <w:t xml:space="preserve">9</w:t>
-            </w:r>
-          </w:p>
-        </w:tc>
-        <w:tc>
-          <w:tcPr>
-            <w:tcW w:w="1800" w:type="dxa"/>
-          </w:tcPr>
-          <w:p>
-            <w:pPr>
-              <w:spacing w:before="40" w:after="40"/>
-            </w:pPr>
-            <w:r>
-              <w:rPr>
-                <w:rFonts w:ascii="Arial" w:hAnsi="Arial" w:cs="Arial"/>
-                <w:sz w:val="19"/>
-                <w:szCs w:val="19"/>
+                <w:sz w:val="18"/>
+                <w:szCs w:val="18"/>
+              </w:rPr>
+              <w:t xml:space="preserve">Ajustado</w:t>
+            </w:r>
+          </w:p>
+        </w:tc>
+        <w:tc>
+          <w:tcPr>
+            <w:tcW w:w="2704" w:type="dxa"/>
+          </w:tcPr>
+          <w:p>
+            <w:pPr>
+              <w:spacing w:before="40" w:after="40"/>
+            </w:pPr>
+            <w:r>
+              <w:rPr>
+                <w:rFonts w:ascii="Arial" w:hAnsi="Arial" w:cs="Arial"/>
+                <w:sz w:val="18"/>
+                <w:szCs w:val="18"/>
+              </w:rPr>
+              <w:t xml:space="preserve">Además de queja o reclamo: severidad, área responsable y fecha compromiso.</w:t>
+            </w:r>
+          </w:p>
+        </w:tc>
+      </w:tr>
+      <w:tr>
+        <w:trPr>
+          <w:cantSplit/>
+        </w:trPr>
+        <w:tc>
+          <w:tcPr>
+            <w:tcW w:w="3100" w:type="dxa"/>
+          </w:tcPr>
+          <w:p>
+            <w:pPr>
+              <w:spacing w:before="40" w:after="40"/>
+            </w:pPr>
+            <w:r>
+              <w:rPr>
+                <w:rFonts w:ascii="Arial" w:hAnsi="Arial" w:cs="Arial"/>
+                <w:sz w:val="18"/>
+                <w:szCs w:val="18"/>
+              </w:rPr>
+              <w:t xml:space="preserve">¿Requiere visita técnica?</w:t>
+            </w:r>
+          </w:p>
+        </w:tc>
+        <w:tc>
+          <w:tcPr>
+            <w:tcW w:w="1600" w:type="dxa"/>
+          </w:tcPr>
+          <w:p>
+            <w:pPr>
+              <w:spacing w:before="40" w:after="40"/>
+            </w:pPr>
+            <w:r>
+              <w:rPr>
+                <w:rFonts w:ascii="Arial" w:hAnsi="Arial" w:cs="Arial"/>
+                <w:sz w:val="18"/>
+                <w:szCs w:val="18"/>
               </w:rPr>
               <w:t xml:space="preserve">Calidad</w:t>
             </w:r>
@@ -5476,37 +5725,584 @@
         </w:tc>
         <w:tc>
           <w:tcPr>
-            <w:tcW w:w="4504" w:type="dxa"/>
-          </w:tcPr>
-          <w:p>
-            <w:pPr>
-              <w:spacing w:before="40" w:after="40"/>
-            </w:pPr>
-            <w:r>
-              <w:rPr>
-                <w:rFonts w:ascii="Arial" w:hAnsi="Arial" w:cs="Arial"/>
-                <w:sz w:val="19"/>
-                <w:szCs w:val="19"/>
-              </w:rPr>
-              <w:t xml:space="preserve">En la fecha programada registra si la acción fue eficaz. No cambia el estado.</w:t>
-            </w:r>
-          </w:p>
-        </w:tc>
-        <w:tc>
-          <w:tcPr>
-            <w:tcW w:w="1500" w:type="dxa"/>
-          </w:tcPr>
-          <w:p>
-            <w:pPr>
-              <w:spacing w:before="40" w:after="40"/>
-            </w:pPr>
-            <w:r>
-              <w:rPr>
-                <w:rFonts w:ascii="Arial" w:hAnsi="Arial" w:cs="Arial"/>
-                <w:sz w:val="19"/>
-                <w:szCs w:val="19"/>
-              </w:rPr>
-              <w:t xml:space="preserve">Cerrado</w:t>
+            <w:tcW w:w="1100" w:type="dxa"/>
+          </w:tcPr>
+          <w:p>
+            <w:pPr>
+              <w:spacing w:before="40" w:after="40"/>
+              <w:jc w:val="center"/>
+            </w:pPr>
+            <w:r>
+              <w:rPr>
+                <w:rFonts w:ascii="Arial" w:hAnsi="Arial" w:cs="Arial"/>
+                <w:sz w:val="18"/>
+                <w:szCs w:val="18"/>
+              </w:rPr>
+              <w:t xml:space="preserve">Nuevo</w:t>
+            </w:r>
+          </w:p>
+        </w:tc>
+        <w:tc>
+          <w:tcPr>
+            <w:tcW w:w="2704" w:type="dxa"/>
+          </w:tcPr>
+          <w:p>
+            <w:pPr>
+              <w:spacing w:before="40" w:after="40"/>
+            </w:pPr>
+            <w:r>
+              <w:rPr>
+                <w:rFonts w:ascii="Arial" w:hAnsi="Arial" w:cs="Arial"/>
+                <w:sz w:val="18"/>
+                <w:szCs w:val="18"/>
+              </w:rPr>
+              <w:t xml:space="preserve">Nuevo.</w:t>
+            </w:r>
+          </w:p>
+        </w:tc>
+      </w:tr>
+      <w:tr>
+        <w:trPr>
+          <w:cantSplit/>
+        </w:trPr>
+        <w:tc>
+          <w:tcPr>
+            <w:tcW w:w="3100" w:type="dxa"/>
+          </w:tcPr>
+          <w:p>
+            <w:pPr>
+              <w:spacing w:before="40" w:after="40"/>
+            </w:pPr>
+            <w:r>
+              <w:rPr>
+                <w:rFonts w:ascii="Arial" w:hAnsi="Arial" w:cs="Arial"/>
+                <w:sz w:val="18"/>
+                <w:szCs w:val="18"/>
+              </w:rPr>
+              <w:t xml:space="preserve">Agendar y realizar visita técnica; registrar hallazgos</w:t>
+            </w:r>
+          </w:p>
+        </w:tc>
+        <w:tc>
+          <w:tcPr>
+            <w:tcW w:w="1600" w:type="dxa"/>
+          </w:tcPr>
+          <w:p>
+            <w:pPr>
+              <w:spacing w:before="40" w:after="40"/>
+            </w:pPr>
+            <w:r>
+              <w:rPr>
+                <w:rFonts w:ascii="Arial" w:hAnsi="Arial" w:cs="Arial"/>
+                <w:sz w:val="18"/>
+                <w:szCs w:val="18"/>
+              </w:rPr>
+              <w:t xml:space="preserve">Calidad</w:t>
+            </w:r>
+          </w:p>
+        </w:tc>
+        <w:tc>
+          <w:tcPr>
+            <w:tcW w:w="1100" w:type="dxa"/>
+          </w:tcPr>
+          <w:p>
+            <w:pPr>
+              <w:spacing w:before="40" w:after="40"/>
+              <w:jc w:val="center"/>
+            </w:pPr>
+            <w:r>
+              <w:rPr>
+                <w:rFonts w:ascii="Arial" w:hAnsi="Arial" w:cs="Arial"/>
+                <w:sz w:val="18"/>
+                <w:szCs w:val="18"/>
+              </w:rPr>
+              <w:t xml:space="preserve">Nuevo</w:t>
+            </w:r>
+          </w:p>
+        </w:tc>
+        <w:tc>
+          <w:tcPr>
+            <w:tcW w:w="2704" w:type="dxa"/>
+          </w:tcPr>
+          <w:p>
+            <w:pPr>
+              <w:spacing w:before="40" w:after="40"/>
+            </w:pPr>
+            <w:r>
+              <w:rPr>
+                <w:rFonts w:ascii="Arial" w:hAnsi="Arial" w:cs="Arial"/>
+                <w:sz w:val="18"/>
+                <w:szCs w:val="18"/>
+              </w:rPr>
+              <w:t xml:space="preserve">Nuevo. Se notifica al asesor para coordinar con el cliente.</w:t>
+            </w:r>
+          </w:p>
+        </w:tc>
+      </w:tr>
+      <w:tr>
+        <w:trPr>
+          <w:cantSplit/>
+        </w:trPr>
+        <w:tc>
+          <w:tcPr>
+            <w:tcW w:w="3100" w:type="dxa"/>
+          </w:tcPr>
+          <w:p>
+            <w:pPr>
+              <w:spacing w:before="40" w:after="40"/>
+            </w:pPr>
+            <w:r>
+              <w:rPr>
+                <w:rFonts w:ascii="Arial" w:hAnsi="Arial" w:cs="Arial"/>
+                <w:sz w:val="18"/>
+                <w:szCs w:val="18"/>
+              </w:rPr>
+              <w:t xml:space="preserve">Analizar: contención, causa raíz y acciones correctivas</w:t>
+            </w:r>
+          </w:p>
+        </w:tc>
+        <w:tc>
+          <w:tcPr>
+            <w:tcW w:w="1600" w:type="dxa"/>
+          </w:tcPr>
+          <w:p>
+            <w:pPr>
+              <w:spacing w:before="40" w:after="40"/>
+            </w:pPr>
+            <w:r>
+              <w:rPr>
+                <w:rFonts w:ascii="Arial" w:hAnsi="Arial" w:cs="Arial"/>
+                <w:sz w:val="18"/>
+                <w:szCs w:val="18"/>
+              </w:rPr>
+              <w:t xml:space="preserve">Área responsable</w:t>
+            </w:r>
+          </w:p>
+        </w:tc>
+        <w:tc>
+          <w:tcPr>
+            <w:tcW w:w="1100" w:type="dxa"/>
+          </w:tcPr>
+          <w:p>
+            <w:pPr>
+              <w:spacing w:before="40" w:after="40"/>
+              <w:jc w:val="center"/>
+            </w:pPr>
+            <w:r>
+              <w:rPr>
+                <w:rFonts w:ascii="Arial" w:hAnsi="Arial" w:cs="Arial"/>
+                <w:sz w:val="18"/>
+                <w:szCs w:val="18"/>
+              </w:rPr>
+              <w:t xml:space="preserve">Ajustado</w:t>
+            </w:r>
+          </w:p>
+        </w:tc>
+        <w:tc>
+          <w:tcPr>
+            <w:tcW w:w="2704" w:type="dxa"/>
+          </w:tcPr>
+          <w:p>
+            <w:pPr>
+              <w:spacing w:before="40" w:after="40"/>
+            </w:pPr>
+            <w:r>
+              <w:rPr>
+                <w:rFonts w:ascii="Arial" w:hAnsi="Arial" w:cs="Arial"/>
+                <w:sz w:val="18"/>
+                <w:szCs w:val="18"/>
+              </w:rPr>
+              <w:t xml:space="preserve">Sistemas dejó abierto quién analiza ("¿y área responsable?"); ahora lo hace el área asignada, con estructura.</w:t>
+            </w:r>
+          </w:p>
+        </w:tc>
+      </w:tr>
+      <w:tr>
+        <w:trPr>
+          <w:cantSplit/>
+        </w:trPr>
+        <w:tc>
+          <w:tcPr>
+            <w:tcW w:w="3100" w:type="dxa"/>
+          </w:tcPr>
+          <w:p>
+            <w:pPr>
+              <w:spacing w:before="40" w:after="40"/>
+            </w:pPr>
+            <w:r>
+              <w:rPr>
+                <w:rFonts w:ascii="Arial" w:hAnsi="Arial" w:cs="Arial"/>
+                <w:sz w:val="18"/>
+                <w:szCs w:val="18"/>
+              </w:rPr>
+              <w:t xml:space="preserve">Registrar solución al cliente y costo</w:t>
+            </w:r>
+          </w:p>
+        </w:tc>
+        <w:tc>
+          <w:tcPr>
+            <w:tcW w:w="1600" w:type="dxa"/>
+          </w:tcPr>
+          <w:p>
+            <w:pPr>
+              <w:spacing w:before="40" w:after="40"/>
+            </w:pPr>
+            <w:r>
+              <w:rPr>
+                <w:rFonts w:ascii="Arial" w:hAnsi="Arial" w:cs="Arial"/>
+                <w:sz w:val="18"/>
+                <w:szCs w:val="18"/>
+              </w:rPr>
+              <w:t xml:space="preserve">Calidad</w:t>
+            </w:r>
+          </w:p>
+        </w:tc>
+        <w:tc>
+          <w:tcPr>
+            <w:tcW w:w="1100" w:type="dxa"/>
+          </w:tcPr>
+          <w:p>
+            <w:pPr>
+              <w:spacing w:before="40" w:after="40"/>
+              <w:jc w:val="center"/>
+            </w:pPr>
+            <w:r>
+              <w:rPr>
+                <w:rFonts w:ascii="Arial" w:hAnsi="Arial" w:cs="Arial"/>
+                <w:sz w:val="18"/>
+                <w:szCs w:val="18"/>
+              </w:rPr>
+              <w:t xml:space="preserve">Nuevo</w:t>
+            </w:r>
+          </w:p>
+        </w:tc>
+        <w:tc>
+          <w:tcPr>
+            <w:tcW w:w="2704" w:type="dxa"/>
+          </w:tcPr>
+          <w:p>
+            <w:pPr>
+              <w:spacing w:before="40" w:after="40"/>
+            </w:pPr>
+            <w:r>
+              <w:rPr>
+                <w:rFonts w:ascii="Arial" w:hAnsi="Arial" w:cs="Arial"/>
+                <w:sz w:val="18"/>
+                <w:szCs w:val="18"/>
+              </w:rPr>
+              <w:t xml:space="preserve">Nuevo.</w:t>
+            </w:r>
+          </w:p>
+        </w:tc>
+      </w:tr>
+      <w:tr>
+        <w:trPr>
+          <w:cantSplit/>
+        </w:trPr>
+        <w:tc>
+          <w:tcPr>
+            <w:tcW w:w="3100" w:type="dxa"/>
+          </w:tcPr>
+          <w:p>
+            <w:pPr>
+              <w:spacing w:before="40" w:after="40"/>
+            </w:pPr>
+            <w:r>
+              <w:rPr>
+                <w:rFonts w:ascii="Arial" w:hAnsi="Arial" w:cs="Arial"/>
+                <w:sz w:val="18"/>
+                <w:szCs w:val="18"/>
+              </w:rPr>
+              <w:t xml:space="preserve">Elaborar Informe de No Conformidad</w:t>
+            </w:r>
+          </w:p>
+        </w:tc>
+        <w:tc>
+          <w:tcPr>
+            <w:tcW w:w="1600" w:type="dxa"/>
+          </w:tcPr>
+          <w:p>
+            <w:pPr>
+              <w:spacing w:before="40" w:after="40"/>
+            </w:pPr>
+            <w:r>
+              <w:rPr>
+                <w:rFonts w:ascii="Arial" w:hAnsi="Arial" w:cs="Arial"/>
+                <w:sz w:val="18"/>
+                <w:szCs w:val="18"/>
+              </w:rPr>
+              <w:t xml:space="preserve">Calidad</w:t>
+            </w:r>
+          </w:p>
+        </w:tc>
+        <w:tc>
+          <w:tcPr>
+            <w:tcW w:w="1100" w:type="dxa"/>
+          </w:tcPr>
+          <w:p>
+            <w:pPr>
+              <w:spacing w:before="40" w:after="40"/>
+              <w:jc w:val="center"/>
+            </w:pPr>
+            <w:r>
+              <w:rPr>
+                <w:rFonts w:ascii="Arial" w:hAnsi="Arial" w:cs="Arial"/>
+                <w:sz w:val="18"/>
+                <w:szCs w:val="18"/>
+              </w:rPr>
+              <w:t xml:space="preserve">Ajustado</w:t>
+            </w:r>
+          </w:p>
+        </w:tc>
+        <w:tc>
+          <w:tcPr>
+            <w:tcW w:w="2704" w:type="dxa"/>
+          </w:tcPr>
+          <w:p>
+            <w:pPr>
+              <w:spacing w:before="40" w:after="40"/>
+            </w:pPr>
+            <w:r>
+              <w:rPr>
+                <w:rFonts w:ascii="Arial" w:hAnsi="Arial" w:cs="Arial"/>
+                <w:sz w:val="18"/>
+                <w:szCs w:val="18"/>
+              </w:rPr>
+              <w:t xml:space="preserve">Reemplaza "Registrar documentación de cierre"; el sistema lo arma con los datos del ticket.</w:t>
+            </w:r>
+          </w:p>
+        </w:tc>
+      </w:tr>
+      <w:tr>
+        <w:trPr>
+          <w:cantSplit/>
+        </w:trPr>
+        <w:tc>
+          <w:tcPr>
+            <w:tcW w:w="3100" w:type="dxa"/>
+          </w:tcPr>
+          <w:p>
+            <w:pPr>
+              <w:spacing w:before="40" w:after="40"/>
+            </w:pPr>
+            <w:r>
+              <w:rPr>
+                <w:rFonts w:ascii="Arial" w:hAnsi="Arial" w:cs="Arial"/>
+                <w:sz w:val="18"/>
+                <w:szCs w:val="18"/>
+              </w:rPr>
+              <w:t xml:space="preserve">Enviar el informe al asesor y al cliente</w:t>
+            </w:r>
+          </w:p>
+        </w:tc>
+        <w:tc>
+          <w:tcPr>
+            <w:tcW w:w="1600" w:type="dxa"/>
+          </w:tcPr>
+          <w:p>
+            <w:pPr>
+              <w:spacing w:before="40" w:after="40"/>
+            </w:pPr>
+            <w:r>
+              <w:rPr>
+                <w:rFonts w:ascii="Arial" w:hAnsi="Arial" w:cs="Arial"/>
+                <w:sz w:val="18"/>
+                <w:szCs w:val="18"/>
+              </w:rPr>
+              <w:t xml:space="preserve">Sistema</w:t>
+            </w:r>
+          </w:p>
+        </w:tc>
+        <w:tc>
+          <w:tcPr>
+            <w:tcW w:w="1100" w:type="dxa"/>
+          </w:tcPr>
+          <w:p>
+            <w:pPr>
+              <w:spacing w:before="40" w:after="40"/>
+              <w:jc w:val="center"/>
+            </w:pPr>
+            <w:r>
+              <w:rPr>
+                <w:rFonts w:ascii="Arial" w:hAnsi="Arial" w:cs="Arial"/>
+                <w:sz w:val="18"/>
+                <w:szCs w:val="18"/>
+              </w:rPr>
+              <w:t xml:space="preserve">Nuevo</w:t>
+            </w:r>
+          </w:p>
+        </w:tc>
+        <w:tc>
+          <w:tcPr>
+            <w:tcW w:w="2704" w:type="dxa"/>
+          </w:tcPr>
+          <w:p>
+            <w:pPr>
+              <w:spacing w:before="40" w:after="40"/>
+            </w:pPr>
+            <w:r>
+              <w:rPr>
+                <w:rFonts w:ascii="Arial" w:hAnsi="Arial" w:cs="Arial"/>
+                <w:sz w:val="18"/>
+                <w:szCs w:val="18"/>
+              </w:rPr>
+              <w:t xml:space="preserve">Nuevo.</w:t>
+            </w:r>
+          </w:p>
+        </w:tc>
+      </w:tr>
+      <w:tr>
+        <w:trPr>
+          <w:cantSplit/>
+        </w:trPr>
+        <w:tc>
+          <w:tcPr>
+            <w:tcW w:w="3100" w:type="dxa"/>
+          </w:tcPr>
+          <w:p>
+            <w:pPr>
+              <w:spacing w:before="40" w:after="40"/>
+            </w:pPr>
+            <w:r>
+              <w:rPr>
+                <w:rFonts w:ascii="Arial" w:hAnsi="Arial" w:cs="Arial"/>
+                <w:sz w:val="18"/>
+                <w:szCs w:val="18"/>
+              </w:rPr>
+              <w:t xml:space="preserve">Cerrar solicitud y programar verificación</w:t>
+            </w:r>
+          </w:p>
+        </w:tc>
+        <w:tc>
+          <w:tcPr>
+            <w:tcW w:w="1600" w:type="dxa"/>
+          </w:tcPr>
+          <w:p>
+            <w:pPr>
+              <w:spacing w:before="40" w:after="40"/>
+            </w:pPr>
+            <w:r>
+              <w:rPr>
+                <w:rFonts w:ascii="Arial" w:hAnsi="Arial" w:cs="Arial"/>
+                <w:sz w:val="18"/>
+                <w:szCs w:val="18"/>
+              </w:rPr>
+              <w:t xml:space="preserve">Calidad</w:t>
+            </w:r>
+          </w:p>
+        </w:tc>
+        <w:tc>
+          <w:tcPr>
+            <w:tcW w:w="1100" w:type="dxa"/>
+          </w:tcPr>
+          <w:p>
+            <w:pPr>
+              <w:spacing w:before="40" w:after="40"/>
+              <w:jc w:val="center"/>
+            </w:pPr>
+            <w:r>
+              <w:rPr>
+                <w:rFonts w:ascii="Arial" w:hAnsi="Arial" w:cs="Arial"/>
+                <w:sz w:val="18"/>
+                <w:szCs w:val="18"/>
+              </w:rPr>
+              <w:t xml:space="preserve">Igual</w:t>
+            </w:r>
+          </w:p>
+        </w:tc>
+        <w:tc>
+          <w:tcPr>
+            <w:tcW w:w="2704" w:type="dxa"/>
+          </w:tcPr>
+          <w:p>
+            <w:pPr>
+              <w:spacing w:before="40" w:after="40"/>
+            </w:pPr>
+            <w:r>
+              <w:rPr>
+                <w:rFonts w:ascii="Arial" w:hAnsi="Arial" w:cs="Arial"/>
+                <w:sz w:val="18"/>
+                <w:szCs w:val="18"/>
+              </w:rPr>
+              <w:t xml:space="preserve">Igual; se agrega la fecha de verificación.</w:t>
+            </w:r>
+          </w:p>
+        </w:tc>
+      </w:tr>
+      <w:tr>
+        <w:trPr>
+          <w:cantSplit/>
+        </w:trPr>
+        <w:tc>
+          <w:tcPr>
+            <w:tcW w:w="3100" w:type="dxa"/>
+          </w:tcPr>
+          <w:p>
+            <w:pPr>
+              <w:spacing w:before="40" w:after="40"/>
+            </w:pPr>
+            <w:r>
+              <w:rPr>
+                <w:rFonts w:ascii="Arial" w:hAnsi="Arial" w:cs="Arial"/>
+                <w:sz w:val="18"/>
+                <w:szCs w:val="18"/>
+              </w:rPr>
+              <w:t xml:space="preserve">Verificar eficacia</w:t>
+            </w:r>
+          </w:p>
+        </w:tc>
+        <w:tc>
+          <w:tcPr>
+            <w:tcW w:w="1600" w:type="dxa"/>
+          </w:tcPr>
+          <w:p>
+            <w:pPr>
+              <w:spacing w:before="40" w:after="40"/>
+            </w:pPr>
+            <w:r>
+              <w:rPr>
+                <w:rFonts w:ascii="Arial" w:hAnsi="Arial" w:cs="Arial"/>
+                <w:sz w:val="18"/>
+                <w:szCs w:val="18"/>
+              </w:rPr>
+              <w:t xml:space="preserve">Calidad</w:t>
+            </w:r>
+          </w:p>
+        </w:tc>
+        <w:tc>
+          <w:tcPr>
+            <w:tcW w:w="1100" w:type="dxa"/>
+          </w:tcPr>
+          <w:p>
+            <w:pPr>
+              <w:spacing w:before="40" w:after="40"/>
+              <w:jc w:val="center"/>
+            </w:pPr>
+            <w:r>
+              <w:rPr>
+                <w:rFonts w:ascii="Arial" w:hAnsi="Arial" w:cs="Arial"/>
+                <w:sz w:val="18"/>
+                <w:szCs w:val="18"/>
+              </w:rPr>
+              <w:t xml:space="preserve">Nuevo</w:t>
+            </w:r>
+          </w:p>
+        </w:tc>
+        <w:tc>
+          <w:tcPr>
+            <w:tcW w:w="2704" w:type="dxa"/>
+          </w:tcPr>
+          <w:p>
+            <w:pPr>
+              <w:spacing w:before="40" w:after="40"/>
+            </w:pPr>
+            <w:r>
+              <w:rPr>
+                <w:rFonts w:ascii="Arial" w:hAnsi="Arial" w:cs="Arial"/>
+                <w:sz w:val="18"/>
+                <w:szCs w:val="18"/>
+              </w:rPr>
+              <w:t xml:space="preserve">Nuevo. No agrega un estado.</w:t>
             </w:r>
           </w:p>
         </w:tc>
@@ -6106,6 +6902,183 @@
           </w:p>
         </w:tc>
       </w:tr>
+      <w:tr>
+        <w:trPr>
+          <w:cantSplit/>
+        </w:trPr>
+        <w:tc>
+          <w:tcPr>
+            <w:tcW w:w="3000" w:type="dxa"/>
+          </w:tcPr>
+          <w:p>
+            <w:pPr>
+              <w:spacing w:before="40" w:after="40"/>
+            </w:pPr>
+            <w:r>
+              <w:rPr>
+                <w:rFonts w:ascii="Arial" w:hAnsi="Arial" w:cs="Arial"/>
+                <w:sz w:val="20"/>
+                <w:szCs w:val="20"/>
+              </w:rPr>
+              <w:t xml:space="preserve">Quién realiza la visita técnica y en qué casos</w:t>
+            </w:r>
+          </w:p>
+        </w:tc>
+        <w:tc>
+          <w:tcPr>
+            <w:tcW w:w="2504" w:type="dxa"/>
+          </w:tcPr>
+          <w:p>
+            <w:pPr>
+              <w:spacing w:before="40" w:after="40"/>
+            </w:pPr>
+            <w:r>
+              <w:rPr>
+                <w:rFonts w:ascii="Arial" w:hAnsi="Arial" w:cs="Arial"/>
+                <w:sz w:val="20"/>
+                <w:szCs w:val="20"/>
+              </w:rPr>
+              <w:t xml:space="preserve">Calidad o Soporte técnico</w:t>
+            </w:r>
+          </w:p>
+        </w:tc>
+        <w:tc>
+          <w:tcPr>
+            <w:tcW w:w="3000" w:type="dxa"/>
+          </w:tcPr>
+          <w:p>
+            <w:pPr>
+              <w:spacing w:before="40" w:after="40"/>
+            </w:pPr>
+            <w:r>
+              <w:rPr>
+                <w:rFonts w:ascii="Arial" w:hAnsi="Arial" w:cs="Arial"/>
+                <w:sz w:val="20"/>
+                <w:szCs w:val="20"/>
+              </w:rPr>
+              <w:t xml:space="preserve">Calidad</w:t>
+            </w:r>
+          </w:p>
+        </w:tc>
+      </w:tr>
+      <w:tr>
+        <w:trPr>
+          <w:cantSplit/>
+        </w:trPr>
+        <w:tc>
+          <w:tcPr>
+            <w:tcW w:w="3000" w:type="dxa"/>
+          </w:tcPr>
+          <w:p>
+            <w:pPr>
+              <w:spacing w:before="40" w:after="40"/>
+            </w:pPr>
+            <w:r>
+              <w:rPr>
+                <w:rFonts w:ascii="Arial" w:hAnsi="Arial" w:cs="Arial"/>
+                <w:sz w:val="20"/>
+                <w:szCs w:val="20"/>
+              </w:rPr>
+              <w:t xml:space="preserve">Formato y numeración del Informe de No Conformidad</w:t>
+            </w:r>
+          </w:p>
+        </w:tc>
+        <w:tc>
+          <w:tcPr>
+            <w:tcW w:w="2504" w:type="dxa"/>
+          </w:tcPr>
+          <w:p>
+            <w:pPr>
+              <w:spacing w:before="40" w:after="40"/>
+            </w:pPr>
+            <w:r>
+              <w:rPr>
+                <w:rFonts w:ascii="Arial" w:hAnsi="Arial" w:cs="Arial"/>
+                <w:sz w:val="20"/>
+                <w:szCs w:val="20"/>
+              </w:rPr>
+              <w:t xml:space="preserve">INC-AAAA-NNNN</w:t>
+            </w:r>
+          </w:p>
+        </w:tc>
+        <w:tc>
+          <w:tcPr>
+            <w:tcW w:w="3000" w:type="dxa"/>
+          </w:tcPr>
+          <w:p>
+            <w:pPr>
+              <w:spacing w:before="40" w:after="40"/>
+            </w:pPr>
+            <w:r>
+              <w:rPr>
+                <w:rFonts w:ascii="Arial" w:hAnsi="Arial" w:cs="Arial"/>
+                <w:sz w:val="20"/>
+                <w:szCs w:val="20"/>
+              </w:rPr>
+              <w:t xml:space="preserve">Calidad</w:t>
+            </w:r>
+          </w:p>
+        </w:tc>
+      </w:tr>
+      <w:tr>
+        <w:trPr>
+          <w:cantSplit/>
+        </w:trPr>
+        <w:tc>
+          <w:tcPr>
+            <w:tcW w:w="3000" w:type="dxa"/>
+          </w:tcPr>
+          <w:p>
+            <w:pPr>
+              <w:spacing w:before="40" w:after="40"/>
+            </w:pPr>
+            <w:r>
+              <w:rPr>
+                <w:rFonts w:ascii="Arial" w:hAnsi="Arial" w:cs="Arial"/>
+                <w:sz w:val="20"/>
+                <w:szCs w:val="20"/>
+              </w:rPr>
+              <w:t xml:space="preserve">Quién envía el informe al cliente</w:t>
+            </w:r>
+          </w:p>
+        </w:tc>
+        <w:tc>
+          <w:tcPr>
+            <w:tcW w:w="2504" w:type="dxa"/>
+          </w:tcPr>
+          <w:p>
+            <w:pPr>
+              <w:spacing w:before="40" w:after="40"/>
+            </w:pPr>
+            <w:r>
+              <w:rPr>
+                <w:rFonts w:ascii="Arial" w:hAnsi="Arial" w:cs="Arial"/>
+                <w:sz w:val="20"/>
+                <w:szCs w:val="20"/>
+              </w:rPr>
+              <w:t xml:space="preserve">El sistema, con copia al asesor</w:t>
+            </w:r>
+          </w:p>
+        </w:tc>
+        <w:tc>
+          <w:tcPr>
+            <w:tcW w:w="3000" w:type="dxa"/>
+          </w:tcPr>
+          <w:p>
+            <w:pPr>
+              <w:spacing w:before="40" w:after="40"/>
+            </w:pPr>
+            <w:r>
+              <w:rPr>
+                <w:rFonts w:ascii="Arial" w:hAnsi="Arial" w:cs="Arial"/>
+                <w:sz w:val="20"/>
+                <w:szCs w:val="20"/>
+              </w:rPr>
+              <w:t xml:space="preserve">Calidad / Comercial</w:t>
+            </w:r>
+          </w:p>
+        </w:tc>
+      </w:tr>
     </w:tbl>
     <w:p>
       <w:pPr>
@@ -6277,7 +7250,7 @@
           <w:sz w:val="24"/>
           <w:szCs w:val="24"/>
         </w:rPr>
-        <w:t xml:space="preserve">Cierre con solución, costo y verificación de eficacia.</w:t>
+        <w:t xml:space="preserve">Ingreso sin foto de la etiqueta de trazabilidad (no debe dejar enviar).</w:t>
       </w:r>
     </w:p>
     <w:p>
@@ -6300,7 +7273,7 @@
           <w:sz w:val="24"/>
           <w:szCs w:val="24"/>
         </w:rPr>
-        <w:t xml:space="preserve">Notificaciones a cada actor en cada cambio de estado.</w:t>
+        <w:t xml:space="preserve">Visita técnica agendada, aviso al asesor y registro de hallazgos.</w:t>
       </w:r>
     </w:p>
     <w:p>
@@ -6323,6 +7296,98 @@
           <w:sz w:val="24"/>
           <w:szCs w:val="24"/>
         </w:rPr>
+        <w:t xml:space="preserve">Elaboración y envío del Informe de No Conformidad; cierre solo después del envío.</w:t>
+      </w:r>
+    </w:p>
+    <w:p>
+      <w:pPr>
+        <w:spacing w:after="80"/>
+        <w:ind w:left="567" w:hanging="283"/>
+        <w:jc w:val="both"/>
+      </w:pPr>
+      <w:r>
+        <w:rPr>
+          <w:rFonts w:ascii="Arial" w:hAnsi="Arial" w:cs="Arial"/>
+          <w:sz w:val="24"/>
+          <w:szCs w:val="24"/>
+        </w:rPr>
+        <w:t xml:space="preserve">•  </w:t>
+      </w:r>
+      <w:r>
+        <w:rPr>
+          <w:rFonts w:ascii="Arial" w:hAnsi="Arial" w:cs="Arial"/>
+          <w:sz w:val="24"/>
+          <w:szCs w:val="24"/>
+        </w:rPr>
+        <w:t xml:space="preserve">Cierre con solución, costo y verificación de eficacia.</w:t>
+      </w:r>
+    </w:p>
+    <w:p>
+      <w:pPr>
+        <w:spacing w:after="80"/>
+        <w:ind w:left="567" w:hanging="283"/>
+        <w:jc w:val="both"/>
+      </w:pPr>
+      <w:r>
+        <w:rPr>
+          <w:rFonts w:ascii="Arial" w:hAnsi="Arial" w:cs="Arial"/>
+          <w:sz w:val="24"/>
+          <w:szCs w:val="24"/>
+        </w:rPr>
+        <w:t xml:space="preserve">•  </w:t>
+      </w:r>
+      <w:r>
+        <w:rPr>
+          <w:rFonts w:ascii="Arial" w:hAnsi="Arial" w:cs="Arial"/>
+          <w:sz w:val="24"/>
+          <w:szCs w:val="24"/>
+        </w:rPr>
+        <w:t xml:space="preserve">Filtros de la bandeja por cliente, asesor, referencia, OP, lote y etiqueta de trazabilidad.</w:t>
+      </w:r>
+    </w:p>
+    <w:p>
+      <w:pPr>
+        <w:spacing w:after="80"/>
+        <w:ind w:left="567" w:hanging="283"/>
+        <w:jc w:val="both"/>
+      </w:pPr>
+      <w:r>
+        <w:rPr>
+          <w:rFonts w:ascii="Arial" w:hAnsi="Arial" w:cs="Arial"/>
+          <w:sz w:val="24"/>
+          <w:szCs w:val="24"/>
+        </w:rPr>
+        <w:t xml:space="preserve">•  </w:t>
+      </w:r>
+      <w:r>
+        <w:rPr>
+          <w:rFonts w:ascii="Arial" w:hAnsi="Arial" w:cs="Arial"/>
+          <w:sz w:val="24"/>
+          <w:szCs w:val="24"/>
+        </w:rPr>
+        <w:t xml:space="preserve">Notificaciones a cada actor en cada cambio de estado.</w:t>
+      </w:r>
+    </w:p>
+    <w:p>
+      <w:pPr>
+        <w:spacing w:after="80"/>
+        <w:ind w:left="567" w:hanging="283"/>
+        <w:jc w:val="both"/>
+      </w:pPr>
+      <w:r>
+        <w:rPr>
+          <w:rFonts w:ascii="Arial" w:hAnsi="Arial" w:cs="Arial"/>
+          <w:sz w:val="24"/>
+          <w:szCs w:val="24"/>
+        </w:rPr>
+        <w:t xml:space="preserve">•  </w:t>
+      </w:r>
+      <w:r>
+        <w:rPr>
+          <w:rFonts w:ascii="Arial" w:hAnsi="Arial" w:cs="Arial"/>
+          <w:sz w:val="24"/>
+          <w:szCs w:val="24"/>
+        </w:rPr>
         <w:t xml:space="preserve">Reportes del mes y exportación a Excel comparados contra los tickets de prueba.</w:t>
       </w:r>
     </w:p>
@@ -6367,7 +7432,7 @@
           <w:sz w:val="24"/>
           <w:szCs w:val="24"/>
         </w:rPr>
-        <w:t xml:space="preserve">Calidad aprueba la estructura general del prototipo y el flujo de estados. Antes del desarrollo se solicita incorporar los cambios de prioridad Alta, principalmente: el análisis por área responsable con causa raíz y acciones, el catálogo de tipos de defecto, los datos de recepción y de trazabilidad, la corrección completa en devoluciones, las notificaciones y los reportes por período.</w:t>
+        <w:t xml:space="preserve">Calidad aprueba la estructura general del prototipo y el flujo de estados. Antes del desarrollo se solicita incorporar los cambios de prioridad Alta, principalmente: el análisis por área responsable con causa raíz y acciones, el catálogo de tipos de defecto, la foto obligatoria de la etiqueta de trazabilidad, la visita técnica, el Informe de No Conformidad de Calidad, los datos de recepción y de trazabilidad, la corrección completa en devoluciones, la bandeja con columnas y filtros, las notificaciones y los reportes por período.</w:t>
       </w:r>
     </w:p>
     <w:p>
@@ -6412,7 +7477,7 @@
           <w:sz w:val="24"/>
           <w:szCs w:val="24"/>
         </w:rPr>
-        <w:t xml:space="preserve">Quito, 2 de octubre de 2026</w:t>
+        <w:t xml:space="preserve">Quito, 6 de octubre de 2026</w:t>
       </w:r>
     </w:p>
     <w:p>
@@ -6508,6 +7573,78 @@
           <w:szCs w:val="24"/>
         </w:rPr>
         <w:t xml:space="preserve">Danilo</w:t>
+      </w:r>
+    </w:p>
+    <w:p>
+      <w:pPr>
+        <w:keepNext/>
+        <w:pageBreakBefore/>
+        <w:spacing w:before="240" w:after="120"/>
+      </w:pPr>
+      <w:r>
+        <w:rPr>
+          <w:rFonts w:ascii="Arial" w:hAnsi="Arial" w:cs="Arial"/>
+          <w:b/>
+          <w:color w:val="2A6BAE"/>
+          <w:sz w:val="28"/>
+          <w:szCs w:val="28"/>
+        </w:rPr>
+        <w:t xml:space="preserve">ANEXO 1: FLUJO PROPUESTO</w:t>
+      </w:r>
+    </w:p>
+    <w:p>
+      <w:pPr>
+        <w:spacing w:after="120"/>
+        <w:jc w:val="both"/>
+      </w:pPr>
+      <w:r>
+        <w:rPr>
+          <w:rFonts w:ascii="Arial" w:hAnsi="Arial" w:cs="Arial"/>
+          <w:sz w:val="24"/>
+          <w:szCs w:val="24"/>
+        </w:rPr>
+        <w:t xml:space="preserve">Colores: azul, igual al flujo de Sistemas; amarillo, ajustado por Calidad; verde, nuevo.</w:t>
+      </w:r>
+    </w:p>
+    <w:p>
+      <w:pPr>
+        <w:jc w:val="center"/>
+      </w:pPr>
+      <w:r>
+        <w:drawing>
+          <wp:inline distT="0" distB="0" distL="0" distR="0">
+            <wp:extent cx="2423000" cy="7920000"/>
+            <wp:docPr id="902" name="Flujo propuesto"/>
+            <wp:cNvGraphicFramePr>
+              <a:graphicFrameLocks xmlns:a="http://schemas.openxmlformats.org/drawingml/2006/main" noChangeAspect="1"/>
+            </wp:cNvGraphicFramePr>
+            <a:graphic xmlns:a="http://schemas.openxmlformats.org/drawingml/2006/main">
+              <a:graphicData uri="http://schemas.openxmlformats.org/drawingml/2006/picture">
+                <pic:pic xmlns:pic="http://schemas.openxmlformats.org/drawingml/2006/picture">
+                  <pic:nvPicPr>
+                    <pic:cNvPr id="902" name="Flujo propuesto"/>
+                    <pic:cNvPicPr/>
+                  </pic:nvPicPr>
+                  <pic:blipFill>
+                    <a:blip r:embed="rIdFlujo"/>
+                    <a:stretch>
+                      <a:fillRect/>
+                    </a:stretch>
+                  </pic:blipFill>
+                  <pic:spPr>
+                    <a:xfrm>
+                      <a:off x="0" y="0"/>
+                      <a:ext cx="2423000" cy="7920000"/>
+                    </a:xfrm>
+                    <a:prstGeom prst="rect">
+                      <a:avLst/>
+                    </a:prstGeom>
+                  </pic:spPr>
+                </pic:pic>
+              </a:graphicData>
+            </a:graphic>
+          </wp:inline>
+        </w:drawing>
       </w:r>
     </w:p>
     <w:sectPr>

</xml_diff>

<commit_message>
Quitar costos y opción de letra grande; corregir ingreso de cantidad
- La cantidad fuera de especificación ya no se escribe al revés
- Se elimina el costo del análisis, del cierre y de los reportes
- Flujo y documentos actualizados sin referencias a costos

Co-Authored-By: Claude Opus 5.5 <noreply@anthropic.com>
Claude-Session: https://claude.ai/code/session_01G3iVUQidUbh96xWzhDrLzE
</commit_message>
<xml_diff>
--- a/propuesta-calidad/Informe_Observaciones_Quejas_Reclamos_ETIMET_Octubre_2026.docx
+++ b/propuesta-calidad/Informe_Observaciones_Quejas_Reclamos_ETIMET_Octubre_2026.docx
@@ -3205,7 +3205,7 @@
                 <w:sz w:val="19"/>
                 <w:szCs w:val="19"/>
               </w:rPr>
-              <w:t xml:space="preserve">Solución al cliente y costo del reclamo</w:t>
+              <w:t xml:space="preserve">Solución al cliente</w:t>
             </w:r>
           </w:p>
         </w:tc>
@@ -3223,7 +3223,7 @@
                 <w:sz w:val="19"/>
                 <w:szCs w:val="19"/>
               </w:rPr>
-              <w:t xml:space="preserve">Tipo de solución (reposición, nota de crédito, reproceso, descuento), cantidad y costo en USD. Permite reportar el costo de la no calidad.</w:t>
+              <w:t xml:space="preserve">Tipo de solución (reposición, nota de crédito, reproceso, descuento o sin compensación) y cantidad. Queda registrada en el ticket y sale en el Informe de No Conformidad.</w:t>
             </w:r>
           </w:p>
         </w:tc>
@@ -4203,7 +4203,7 @@
                 <w:sz w:val="19"/>
                 <w:szCs w:val="19"/>
               </w:rPr>
-              <w:t xml:space="preserve">Reportes por período, Pareto y costos</w:t>
+              <w:t xml:space="preserve">Reportes por período y Pareto</w:t>
             </w:r>
           </w:p>
         </w:tc>
@@ -4221,7 +4221,7 @@
                 <w:sz w:val="19"/>
                 <w:szCs w:val="19"/>
               </w:rPr>
-              <w:t xml:space="preserve">Filtro por mes; Pareto de tipos de defecto; por área responsable y por máquina; tiempo promedio de cierre; costo total; devoluciones por asesor; exportar.</w:t>
+              <w:t xml:space="preserve">Filtro por mes; Pareto de tipos de defecto; por área responsable y por máquina; tiempo promedio de cierre; visitas técnicas; devoluciones por asesor; exportar.</w:t>
             </w:r>
           </w:p>
         </w:tc>
@@ -5935,7 +5935,7 @@
                 <w:sz w:val="18"/>
                 <w:szCs w:val="18"/>
               </w:rPr>
-              <w:t xml:space="preserve">Registrar solución al cliente y costo</w:t>
+              <w:t xml:space="preserve">Registrar solución al cliente</w:t>
             </w:r>
           </w:p>
         </w:tc>
@@ -5990,7 +5990,7 @@
                 <w:sz w:val="18"/>
                 <w:szCs w:val="18"/>
               </w:rPr>
-              <w:t xml:space="preserve">Nuevo.</w:t>
+              <w:t xml:space="preserve">Nuevo: tipo de solución y cantidad.</w:t>
             </w:r>
           </w:p>
         </w:tc>
@@ -7319,7 +7319,7 @@
           <w:sz w:val="24"/>
           <w:szCs w:val="24"/>
         </w:rPr>
-        <w:t xml:space="preserve">Cierre con solución, costo y verificación de eficacia.</w:t>
+        <w:t xml:space="preserve">Cierre con solución al cliente y verificación de eficacia.</w:t>
       </w:r>
     </w:p>
     <w:p>

</xml_diff>